<commit_message>
Added executive dashboards, marketing analytics, customer health analytics, and AI decision center
</commit_message>
<xml_diff>
--- a/Framework and steps to ai revenue intelligence.docx
+++ b/Framework and steps to ai revenue intelligence.docx
@@ -10,17 +10,17 @@
           <w:rFonts w:ascii="Times New Roman" w:eastAsia="Times New Roman" w:hAnsi="Times New Roman" w:cs="Times New Roman"/>
           <w:b/>
           <w:bCs/>
-          <w:sz w:val="27"/>
-          <w:szCs w:val="27"/>
-        </w:rPr>
-      </w:pPr>
-      <w:r>
-        <w:rPr>
-          <w:rFonts w:ascii="Times New Roman" w:eastAsia="Times New Roman" w:hAnsi="Times New Roman" w:cs="Times New Roman"/>
-          <w:b/>
-          <w:bCs/>
-          <w:sz w:val="27"/>
-          <w:szCs w:val="27"/>
+          <w:sz w:val="24"/>
+          <w:szCs w:val="24"/>
+        </w:rPr>
+      </w:pPr>
+      <w:r>
+        <w:rPr>
+          <w:rFonts w:ascii="Times New Roman" w:eastAsia="Times New Roman" w:hAnsi="Times New Roman" w:cs="Times New Roman"/>
+          <w:b/>
+          <w:bCs/>
+          <w:sz w:val="24"/>
+          <w:szCs w:val="24"/>
         </w:rPr>
         <w:t>Business Problem</w:t>
       </w:r>
@@ -29,12 +29,17 @@
           <w:rFonts w:ascii="Times New Roman" w:eastAsia="Times New Roman" w:hAnsi="Times New Roman" w:cs="Times New Roman"/>
           <w:b/>
           <w:bCs/>
-          <w:sz w:val="27"/>
-          <w:szCs w:val="27"/>
+          <w:sz w:val="24"/>
+          <w:szCs w:val="24"/>
         </w:rPr>
         <w:t xml:space="preserve">: </w:t>
       </w:r>
       <w:r>
+        <w:rPr>
+          <w:rFonts w:ascii="Times New Roman" w:hAnsi="Times New Roman" w:cs="Times New Roman"/>
+          <w:sz w:val="24"/>
+          <w:szCs w:val="24"/>
+        </w:rPr>
         <w:t>Executives spend hours gathering reports but still struggle to make fast, data-driven revenue decisions.</w:t>
       </w:r>
     </w:p>
@@ -46,21 +51,26 @@
           <w:rFonts w:ascii="Times New Roman" w:eastAsia="Times New Roman" w:hAnsi="Times New Roman" w:cs="Times New Roman"/>
           <w:b/>
           <w:bCs/>
-          <w:sz w:val="27"/>
-          <w:szCs w:val="27"/>
-        </w:rPr>
-      </w:pPr>
-      <w:r>
-        <w:rPr>
-          <w:rFonts w:ascii="Times New Roman" w:eastAsia="Times New Roman" w:hAnsi="Times New Roman" w:cs="Times New Roman"/>
-          <w:b/>
-          <w:bCs/>
-          <w:sz w:val="27"/>
-          <w:szCs w:val="27"/>
+          <w:sz w:val="24"/>
+          <w:szCs w:val="24"/>
+        </w:rPr>
+      </w:pPr>
+      <w:r>
+        <w:rPr>
+          <w:rFonts w:ascii="Times New Roman" w:eastAsia="Times New Roman" w:hAnsi="Times New Roman" w:cs="Times New Roman"/>
+          <w:b/>
+          <w:bCs/>
+          <w:sz w:val="24"/>
+          <w:szCs w:val="24"/>
         </w:rPr>
         <w:t>Solution Provide</w:t>
       </w:r>
       <w:r>
+        <w:rPr>
+          <w:rFonts w:ascii="Times New Roman" w:hAnsi="Times New Roman" w:cs="Times New Roman"/>
+          <w:sz w:val="24"/>
+          <w:szCs w:val="24"/>
+        </w:rPr>
         <w:t xml:space="preserve"> executives with a single source of truth for revenue performance, forecasts, risks, and recommended actions."</w:t>
       </w:r>
     </w:p>
@@ -355,8 +365,8 @@
           <w:b/>
           <w:bCs/>
           <w:kern w:val="36"/>
-          <w:sz w:val="48"/>
-          <w:szCs w:val="48"/>
+          <w:sz w:val="24"/>
+          <w:szCs w:val="24"/>
         </w:rPr>
       </w:pPr>
       <w:r>
@@ -365,8 +375,8 @@
           <w:b/>
           <w:bCs/>
           <w:kern w:val="36"/>
-          <w:sz w:val="48"/>
-          <w:szCs w:val="48"/>
+          <w:sz w:val="24"/>
+          <w:szCs w:val="24"/>
         </w:rPr>
         <w:t>What the final platform will show</w:t>
       </w:r>
@@ -379,17 +389,17 @@
           <w:rFonts w:ascii="Times New Roman" w:eastAsia="Times New Roman" w:hAnsi="Times New Roman" w:cs="Times New Roman"/>
           <w:b/>
           <w:bCs/>
-          <w:sz w:val="27"/>
-          <w:szCs w:val="27"/>
-        </w:rPr>
-      </w:pPr>
-      <w:r>
-        <w:rPr>
-          <w:rFonts w:ascii="Times New Roman" w:eastAsia="Times New Roman" w:hAnsi="Times New Roman" w:cs="Times New Roman"/>
-          <w:b/>
-          <w:bCs/>
-          <w:sz w:val="27"/>
-          <w:szCs w:val="27"/>
+          <w:sz w:val="24"/>
+          <w:szCs w:val="24"/>
+        </w:rPr>
+      </w:pPr>
+      <w:r>
+        <w:rPr>
+          <w:rFonts w:ascii="Times New Roman" w:eastAsia="Times New Roman" w:hAnsi="Times New Roman" w:cs="Times New Roman"/>
+          <w:b/>
+          <w:bCs/>
+          <w:sz w:val="24"/>
+          <w:szCs w:val="24"/>
         </w:rPr>
         <w:t>Executive Dashboard</w:t>
       </w:r>
@@ -569,7 +579,6 @@
           <w:sz w:val="24"/>
           <w:szCs w:val="24"/>
         </w:rPr>
-        <w:lastRenderedPageBreak/>
         <w:t xml:space="preserve">Active Customers </w:t>
       </w:r>
     </w:p>
@@ -592,6 +601,7 @@
           <w:sz w:val="24"/>
           <w:szCs w:val="24"/>
         </w:rPr>
+        <w:lastRenderedPageBreak/>
         <w:t xml:space="preserve">Churn Rate </w:t>
       </w:r>
     </w:p>
@@ -1003,8 +1013,8 @@
           <w:b/>
           <w:bCs/>
           <w:kern w:val="36"/>
-          <w:sz w:val="48"/>
-          <w:szCs w:val="48"/>
+          <w:sz w:val="24"/>
+          <w:szCs w:val="24"/>
         </w:rPr>
       </w:pPr>
       <w:r>
@@ -1013,8 +1023,8 @@
           <w:b/>
           <w:bCs/>
           <w:kern w:val="36"/>
-          <w:sz w:val="48"/>
-          <w:szCs w:val="48"/>
+          <w:sz w:val="24"/>
+          <w:szCs w:val="24"/>
         </w:rPr>
         <w:t>Architecture</w:t>
       </w:r>
@@ -1041,141 +1051,149 @@
         </w:tabs>
         <w:spacing w:after="0" w:line="240" w:lineRule="auto"/>
         <w:rPr>
-          <w:rFonts w:ascii="Courier New" w:eastAsia="Times New Roman" w:hAnsi="Courier New" w:cs="Courier New"/>
-          <w:sz w:val="20"/>
-          <w:szCs w:val="20"/>
-        </w:rPr>
-      </w:pPr>
-      <w:r>
-        <w:rPr>
-          <w:rFonts w:ascii="Courier New" w:eastAsia="Times New Roman" w:hAnsi="Courier New" w:cs="Courier New"/>
-          <w:sz w:val="20"/>
-          <w:szCs w:val="20"/>
+          <w:rFonts w:ascii="Times New Roman" w:eastAsia="Times New Roman" w:hAnsi="Times New Roman" w:cs="Times New Roman"/>
+          <w:sz w:val="24"/>
+          <w:szCs w:val="24"/>
+        </w:rPr>
+      </w:pPr>
+      <w:r>
+        <w:rPr>
+          <w:rFonts w:ascii="Times New Roman" w:eastAsia="Times New Roman" w:hAnsi="Times New Roman" w:cs="Times New Roman"/>
+          <w:sz w:val="24"/>
+          <w:szCs w:val="24"/>
         </w:rPr>
         <w:t>Raw Data</w:t>
       </w:r>
       <w:r>
         <w:rPr>
-          <w:rFonts w:ascii="Courier New" w:eastAsia="Times New Roman" w:hAnsi="Courier New" w:cs="Courier New"/>
-          <w:sz w:val="20"/>
-          <w:szCs w:val="20"/>
+          <w:rFonts w:ascii="Times New Roman" w:eastAsia="Times New Roman" w:hAnsi="Times New Roman" w:cs="Times New Roman"/>
+          <w:sz w:val="24"/>
+          <w:szCs w:val="24"/>
         </w:rPr>
         <w:br/>
         <w:t xml:space="preserve">   ↓</w:t>
       </w:r>
       <w:r>
         <w:rPr>
-          <w:rFonts w:ascii="Courier New" w:eastAsia="Times New Roman" w:hAnsi="Courier New" w:cs="Courier New"/>
-          <w:sz w:val="20"/>
-          <w:szCs w:val="20"/>
+          <w:rFonts w:ascii="Times New Roman" w:eastAsia="Times New Roman" w:hAnsi="Times New Roman" w:cs="Times New Roman"/>
+          <w:sz w:val="24"/>
+          <w:szCs w:val="24"/>
         </w:rPr>
         <w:br/>
       </w:r>
       <w:proofErr w:type="spellStart"/>
       <w:r>
         <w:rPr>
-          <w:rFonts w:ascii="Courier New" w:eastAsia="Times New Roman" w:hAnsi="Courier New" w:cs="Courier New"/>
-          <w:sz w:val="20"/>
-          <w:szCs w:val="20"/>
+          <w:rFonts w:ascii="Times New Roman" w:eastAsia="Times New Roman" w:hAnsi="Times New Roman" w:cs="Times New Roman"/>
+          <w:sz w:val="24"/>
+          <w:szCs w:val="24"/>
         </w:rPr>
         <w:t>Databricks</w:t>
       </w:r>
       <w:proofErr w:type="spellEnd"/>
       <w:r>
         <w:rPr>
-          <w:rFonts w:ascii="Courier New" w:eastAsia="Times New Roman" w:hAnsi="Courier New" w:cs="Courier New"/>
-          <w:sz w:val="20"/>
-          <w:szCs w:val="20"/>
+          <w:rFonts w:ascii="Times New Roman" w:eastAsia="Times New Roman" w:hAnsi="Times New Roman" w:cs="Times New Roman"/>
+          <w:sz w:val="24"/>
+          <w:szCs w:val="24"/>
         </w:rPr>
         <w:br/>
         <w:t xml:space="preserve">   ↓</w:t>
       </w:r>
       <w:r>
         <w:rPr>
-          <w:rFonts w:ascii="Courier New" w:eastAsia="Times New Roman" w:hAnsi="Courier New" w:cs="Courier New"/>
-          <w:sz w:val="20"/>
-          <w:szCs w:val="20"/>
+          <w:rFonts w:ascii="Times New Roman" w:eastAsia="Times New Roman" w:hAnsi="Times New Roman" w:cs="Times New Roman"/>
+          <w:sz w:val="24"/>
+          <w:szCs w:val="24"/>
         </w:rPr>
         <w:br/>
         <w:t>Snowflake</w:t>
       </w:r>
       <w:r>
         <w:rPr>
-          <w:rFonts w:ascii="Courier New" w:eastAsia="Times New Roman" w:hAnsi="Courier New" w:cs="Courier New"/>
-          <w:sz w:val="20"/>
-          <w:szCs w:val="20"/>
+          <w:rFonts w:ascii="Times New Roman" w:eastAsia="Times New Roman" w:hAnsi="Times New Roman" w:cs="Times New Roman"/>
+          <w:sz w:val="24"/>
+          <w:szCs w:val="24"/>
         </w:rPr>
         <w:br/>
         <w:t xml:space="preserve">   ↓</w:t>
       </w:r>
       <w:r>
         <w:rPr>
-          <w:rFonts w:ascii="Courier New" w:eastAsia="Times New Roman" w:hAnsi="Courier New" w:cs="Courier New"/>
-          <w:sz w:val="20"/>
-          <w:szCs w:val="20"/>
+          <w:rFonts w:ascii="Times New Roman" w:eastAsia="Times New Roman" w:hAnsi="Times New Roman" w:cs="Times New Roman"/>
+          <w:sz w:val="24"/>
+          <w:szCs w:val="24"/>
         </w:rPr>
         <w:br/>
       </w:r>
       <w:proofErr w:type="spellStart"/>
       <w:r>
         <w:rPr>
-          <w:rFonts w:ascii="Courier New" w:eastAsia="Times New Roman" w:hAnsi="Courier New" w:cs="Courier New"/>
-          <w:sz w:val="20"/>
-          <w:szCs w:val="20"/>
+          <w:rFonts w:ascii="Times New Roman" w:eastAsia="Times New Roman" w:hAnsi="Times New Roman" w:cs="Times New Roman"/>
+          <w:sz w:val="24"/>
+          <w:szCs w:val="24"/>
         </w:rPr>
         <w:t>dbt</w:t>
       </w:r>
       <w:proofErr w:type="spellEnd"/>
       <w:r>
         <w:rPr>
-          <w:rFonts w:ascii="Courier New" w:eastAsia="Times New Roman" w:hAnsi="Courier New" w:cs="Courier New"/>
-          <w:sz w:val="20"/>
-          <w:szCs w:val="20"/>
+          <w:rFonts w:ascii="Times New Roman" w:eastAsia="Times New Roman" w:hAnsi="Times New Roman" w:cs="Times New Roman"/>
+          <w:sz w:val="24"/>
+          <w:szCs w:val="24"/>
         </w:rPr>
         <w:br/>
         <w:t xml:space="preserve">   ↓</w:t>
       </w:r>
       <w:r>
         <w:rPr>
-          <w:rFonts w:ascii="Courier New" w:eastAsia="Times New Roman" w:hAnsi="Courier New" w:cs="Courier New"/>
-          <w:sz w:val="20"/>
-          <w:szCs w:val="20"/>
+          <w:rFonts w:ascii="Times New Roman" w:eastAsia="Times New Roman" w:hAnsi="Times New Roman" w:cs="Times New Roman"/>
+          <w:sz w:val="24"/>
+          <w:szCs w:val="24"/>
         </w:rPr>
         <w:br/>
         <w:t>ML Models</w:t>
       </w:r>
       <w:r>
         <w:rPr>
-          <w:rFonts w:ascii="Courier New" w:eastAsia="Times New Roman" w:hAnsi="Courier New" w:cs="Courier New"/>
-          <w:sz w:val="20"/>
-          <w:szCs w:val="20"/>
+          <w:rFonts w:ascii="Times New Roman" w:eastAsia="Times New Roman" w:hAnsi="Times New Roman" w:cs="Times New Roman"/>
+          <w:sz w:val="24"/>
+          <w:szCs w:val="24"/>
         </w:rPr>
         <w:br/>
         <w:t xml:space="preserve">   ↓</w:t>
       </w:r>
       <w:r>
         <w:rPr>
-          <w:rFonts w:ascii="Courier New" w:eastAsia="Times New Roman" w:hAnsi="Courier New" w:cs="Courier New"/>
-          <w:sz w:val="20"/>
-          <w:szCs w:val="20"/>
+          <w:rFonts w:ascii="Times New Roman" w:eastAsia="Times New Roman" w:hAnsi="Times New Roman" w:cs="Times New Roman"/>
+          <w:sz w:val="24"/>
+          <w:szCs w:val="24"/>
         </w:rPr>
         <w:br/>
         <w:t>Power BI / Tableau</w:t>
       </w:r>
       <w:r>
         <w:rPr>
-          <w:rFonts w:ascii="Courier New" w:eastAsia="Times New Roman" w:hAnsi="Courier New" w:cs="Courier New"/>
-          <w:sz w:val="20"/>
-          <w:szCs w:val="20"/>
+          <w:rFonts w:ascii="Times New Roman" w:eastAsia="Times New Roman" w:hAnsi="Times New Roman" w:cs="Times New Roman"/>
+          <w:sz w:val="24"/>
+          <w:szCs w:val="24"/>
         </w:rPr>
         <w:br/>
+      </w:r>
+      <w:r>
+        <w:rPr>
+          <w:rFonts w:ascii="Times New Roman" w:eastAsia="Times New Roman" w:hAnsi="Times New Roman" w:cs="Times New Roman"/>
+          <w:sz w:val="24"/>
+          <w:szCs w:val="24"/>
+        </w:rPr>
+        <w:lastRenderedPageBreak/>
         <w:t xml:space="preserve">   ↓</w:t>
       </w:r>
       <w:r>
         <w:rPr>
-          <w:rFonts w:ascii="Courier New" w:eastAsia="Times New Roman" w:hAnsi="Courier New" w:cs="Courier New"/>
-          <w:sz w:val="20"/>
-          <w:szCs w:val="20"/>
+          <w:rFonts w:ascii="Times New Roman" w:eastAsia="Times New Roman" w:hAnsi="Times New Roman" w:cs="Times New Roman"/>
+          <w:sz w:val="24"/>
+          <w:szCs w:val="24"/>
         </w:rPr>
         <w:br/>
         <w:t>Executive Decision Dashboard</w:t>
@@ -1196,7 +1214,6 @@
           <w:sz w:val="24"/>
           <w:szCs w:val="24"/>
         </w:rPr>
-        <w:lastRenderedPageBreak/>
         <w:pict>
           <v:rect id="_x0000_i1027" style="width:0;height:1.5pt" o:hralign="center" o:hrstd="t" o:hr="t" fillcolor="#a0a0a0" stroked="f"/>
         </w:pict>
@@ -1211,8 +1228,8 @@
           <w:b/>
           <w:bCs/>
           <w:kern w:val="36"/>
-          <w:sz w:val="48"/>
-          <w:szCs w:val="48"/>
+          <w:sz w:val="24"/>
+          <w:szCs w:val="24"/>
         </w:rPr>
       </w:pPr>
       <w:r>
@@ -1221,8 +1238,8 @@
           <w:b/>
           <w:bCs/>
           <w:kern w:val="36"/>
-          <w:sz w:val="48"/>
-          <w:szCs w:val="48"/>
+          <w:sz w:val="24"/>
+          <w:szCs w:val="24"/>
         </w:rPr>
         <w:t>Phase 1 — Data Generation</w:t>
       </w:r>
@@ -1253,17 +1270,17 @@
           <w:rFonts w:ascii="Times New Roman" w:eastAsia="Times New Roman" w:hAnsi="Times New Roman" w:cs="Times New Roman"/>
           <w:b/>
           <w:bCs/>
-          <w:sz w:val="27"/>
-          <w:szCs w:val="27"/>
-        </w:rPr>
-      </w:pPr>
-      <w:r>
-        <w:rPr>
-          <w:rFonts w:ascii="Times New Roman" w:eastAsia="Times New Roman" w:hAnsi="Times New Roman" w:cs="Times New Roman"/>
-          <w:b/>
-          <w:bCs/>
-          <w:sz w:val="27"/>
-          <w:szCs w:val="27"/>
+          <w:sz w:val="24"/>
+          <w:szCs w:val="24"/>
+        </w:rPr>
+      </w:pPr>
+      <w:r>
+        <w:rPr>
+          <w:rFonts w:ascii="Times New Roman" w:eastAsia="Times New Roman" w:hAnsi="Times New Roman" w:cs="Times New Roman"/>
+          <w:b/>
+          <w:bCs/>
+          <w:sz w:val="24"/>
+          <w:szCs w:val="24"/>
         </w:rPr>
         <w:t>Customers</w:t>
       </w:r>
@@ -1290,62 +1307,62 @@
         </w:tabs>
         <w:spacing w:after="0" w:line="240" w:lineRule="auto"/>
         <w:rPr>
-          <w:rFonts w:ascii="Courier New" w:eastAsia="Times New Roman" w:hAnsi="Courier New" w:cs="Courier New"/>
-          <w:sz w:val="20"/>
-          <w:szCs w:val="20"/>
+          <w:rFonts w:ascii="Times New Roman" w:eastAsia="Times New Roman" w:hAnsi="Times New Roman" w:cs="Times New Roman"/>
+          <w:sz w:val="24"/>
+          <w:szCs w:val="24"/>
         </w:rPr>
       </w:pPr>
       <w:proofErr w:type="spellStart"/>
       <w:r>
         <w:rPr>
-          <w:rFonts w:ascii="Courier New" w:eastAsia="Times New Roman" w:hAnsi="Courier New" w:cs="Courier New"/>
-          <w:sz w:val="20"/>
-          <w:szCs w:val="20"/>
+          <w:rFonts w:ascii="Times New Roman" w:eastAsia="Times New Roman" w:hAnsi="Times New Roman" w:cs="Times New Roman"/>
+          <w:sz w:val="24"/>
+          <w:szCs w:val="24"/>
         </w:rPr>
         <w:t>customer_id</w:t>
       </w:r>
       <w:proofErr w:type="spellEnd"/>
       <w:r>
         <w:rPr>
-          <w:rFonts w:ascii="Courier New" w:eastAsia="Times New Roman" w:hAnsi="Courier New" w:cs="Courier New"/>
-          <w:sz w:val="20"/>
-          <w:szCs w:val="20"/>
+          <w:rFonts w:ascii="Times New Roman" w:eastAsia="Times New Roman" w:hAnsi="Times New Roman" w:cs="Times New Roman"/>
+          <w:sz w:val="24"/>
+          <w:szCs w:val="24"/>
         </w:rPr>
         <w:br/>
         <w:t>industry</w:t>
       </w:r>
       <w:r>
         <w:rPr>
-          <w:rFonts w:ascii="Courier New" w:eastAsia="Times New Roman" w:hAnsi="Courier New" w:cs="Courier New"/>
-          <w:sz w:val="20"/>
-          <w:szCs w:val="20"/>
+          <w:rFonts w:ascii="Times New Roman" w:eastAsia="Times New Roman" w:hAnsi="Times New Roman" w:cs="Times New Roman"/>
+          <w:sz w:val="24"/>
+          <w:szCs w:val="24"/>
         </w:rPr>
         <w:br/>
         <w:t>region</w:t>
       </w:r>
       <w:r>
         <w:rPr>
-          <w:rFonts w:ascii="Courier New" w:eastAsia="Times New Roman" w:hAnsi="Courier New" w:cs="Courier New"/>
-          <w:sz w:val="20"/>
-          <w:szCs w:val="20"/>
+          <w:rFonts w:ascii="Times New Roman" w:eastAsia="Times New Roman" w:hAnsi="Times New Roman" w:cs="Times New Roman"/>
+          <w:sz w:val="24"/>
+          <w:szCs w:val="24"/>
         </w:rPr>
         <w:br/>
       </w:r>
       <w:proofErr w:type="spellStart"/>
       <w:r>
         <w:rPr>
-          <w:rFonts w:ascii="Courier New" w:eastAsia="Times New Roman" w:hAnsi="Courier New" w:cs="Courier New"/>
-          <w:sz w:val="20"/>
-          <w:szCs w:val="20"/>
+          <w:rFonts w:ascii="Times New Roman" w:eastAsia="Times New Roman" w:hAnsi="Times New Roman" w:cs="Times New Roman"/>
+          <w:sz w:val="24"/>
+          <w:szCs w:val="24"/>
         </w:rPr>
         <w:t>signup_date</w:t>
       </w:r>
       <w:proofErr w:type="spellEnd"/>
       <w:r>
         <w:rPr>
-          <w:rFonts w:ascii="Courier New" w:eastAsia="Times New Roman" w:hAnsi="Courier New" w:cs="Courier New"/>
-          <w:sz w:val="20"/>
-          <w:szCs w:val="20"/>
+          <w:rFonts w:ascii="Times New Roman" w:eastAsia="Times New Roman" w:hAnsi="Times New Roman" w:cs="Times New Roman"/>
+          <w:sz w:val="24"/>
+          <w:szCs w:val="24"/>
         </w:rPr>
         <w:br/>
         <w:t>plan</w:t>
@@ -1359,17 +1376,17 @@
           <w:rFonts w:ascii="Times New Roman" w:eastAsia="Times New Roman" w:hAnsi="Times New Roman" w:cs="Times New Roman"/>
           <w:b/>
           <w:bCs/>
-          <w:sz w:val="27"/>
-          <w:szCs w:val="27"/>
-        </w:rPr>
-      </w:pPr>
-      <w:r>
-        <w:rPr>
-          <w:rFonts w:ascii="Times New Roman" w:eastAsia="Times New Roman" w:hAnsi="Times New Roman" w:cs="Times New Roman"/>
-          <w:b/>
-          <w:bCs/>
-          <w:sz w:val="27"/>
-          <w:szCs w:val="27"/>
+          <w:sz w:val="24"/>
+          <w:szCs w:val="24"/>
+        </w:rPr>
+      </w:pPr>
+      <w:r>
+        <w:rPr>
+          <w:rFonts w:ascii="Times New Roman" w:eastAsia="Times New Roman" w:hAnsi="Times New Roman" w:cs="Times New Roman"/>
+          <w:b/>
+          <w:bCs/>
+          <w:sz w:val="24"/>
+          <w:szCs w:val="24"/>
         </w:rPr>
         <w:t>Revenue</w:t>
       </w:r>
@@ -1396,42 +1413,42 @@
         </w:tabs>
         <w:spacing w:after="0" w:line="240" w:lineRule="auto"/>
         <w:rPr>
-          <w:rFonts w:ascii="Courier New" w:eastAsia="Times New Roman" w:hAnsi="Courier New" w:cs="Courier New"/>
-          <w:sz w:val="20"/>
-          <w:szCs w:val="20"/>
-        </w:rPr>
-      </w:pPr>
-      <w:r>
-        <w:rPr>
-          <w:rFonts w:ascii="Courier New" w:eastAsia="Times New Roman" w:hAnsi="Courier New" w:cs="Courier New"/>
-          <w:sz w:val="20"/>
-          <w:szCs w:val="20"/>
+          <w:rFonts w:ascii="Times New Roman" w:eastAsia="Times New Roman" w:hAnsi="Times New Roman" w:cs="Times New Roman"/>
+          <w:sz w:val="24"/>
+          <w:szCs w:val="24"/>
+        </w:rPr>
+      </w:pPr>
+      <w:r>
+        <w:rPr>
+          <w:rFonts w:ascii="Times New Roman" w:eastAsia="Times New Roman" w:hAnsi="Times New Roman" w:cs="Times New Roman"/>
+          <w:sz w:val="24"/>
+          <w:szCs w:val="24"/>
         </w:rPr>
         <w:t>date</w:t>
       </w:r>
       <w:r>
         <w:rPr>
-          <w:rFonts w:ascii="Courier New" w:eastAsia="Times New Roman" w:hAnsi="Courier New" w:cs="Courier New"/>
-          <w:sz w:val="20"/>
-          <w:szCs w:val="20"/>
+          <w:rFonts w:ascii="Times New Roman" w:eastAsia="Times New Roman" w:hAnsi="Times New Roman" w:cs="Times New Roman"/>
+          <w:sz w:val="24"/>
+          <w:szCs w:val="24"/>
         </w:rPr>
         <w:br/>
       </w:r>
       <w:proofErr w:type="spellStart"/>
       <w:r>
         <w:rPr>
-          <w:rFonts w:ascii="Courier New" w:eastAsia="Times New Roman" w:hAnsi="Courier New" w:cs="Courier New"/>
-          <w:sz w:val="20"/>
-          <w:szCs w:val="20"/>
+          <w:rFonts w:ascii="Times New Roman" w:eastAsia="Times New Roman" w:hAnsi="Times New Roman" w:cs="Times New Roman"/>
+          <w:sz w:val="24"/>
+          <w:szCs w:val="24"/>
         </w:rPr>
         <w:t>customer_id</w:t>
       </w:r>
       <w:proofErr w:type="spellEnd"/>
       <w:r>
         <w:rPr>
-          <w:rFonts w:ascii="Courier New" w:eastAsia="Times New Roman" w:hAnsi="Courier New" w:cs="Courier New"/>
-          <w:sz w:val="20"/>
-          <w:szCs w:val="20"/>
+          <w:rFonts w:ascii="Times New Roman" w:eastAsia="Times New Roman" w:hAnsi="Times New Roman" w:cs="Times New Roman"/>
+          <w:sz w:val="24"/>
+          <w:szCs w:val="24"/>
         </w:rPr>
         <w:br/>
         <w:t>revenue</w:t>
@@ -1445,17 +1462,17 @@
           <w:rFonts w:ascii="Times New Roman" w:eastAsia="Times New Roman" w:hAnsi="Times New Roman" w:cs="Times New Roman"/>
           <w:b/>
           <w:bCs/>
-          <w:sz w:val="27"/>
-          <w:szCs w:val="27"/>
-        </w:rPr>
-      </w:pPr>
-      <w:r>
-        <w:rPr>
-          <w:rFonts w:ascii="Times New Roman" w:eastAsia="Times New Roman" w:hAnsi="Times New Roman" w:cs="Times New Roman"/>
-          <w:b/>
-          <w:bCs/>
-          <w:sz w:val="27"/>
-          <w:szCs w:val="27"/>
+          <w:sz w:val="24"/>
+          <w:szCs w:val="24"/>
+        </w:rPr>
+      </w:pPr>
+      <w:r>
+        <w:rPr>
+          <w:rFonts w:ascii="Times New Roman" w:eastAsia="Times New Roman" w:hAnsi="Times New Roman" w:cs="Times New Roman"/>
+          <w:b/>
+          <w:bCs/>
+          <w:sz w:val="24"/>
+          <w:szCs w:val="24"/>
         </w:rPr>
         <w:t>Sales</w:t>
       </w:r>
@@ -1482,62 +1499,62 @@
         </w:tabs>
         <w:spacing w:after="0" w:line="240" w:lineRule="auto"/>
         <w:rPr>
-          <w:rFonts w:ascii="Courier New" w:eastAsia="Times New Roman" w:hAnsi="Courier New" w:cs="Courier New"/>
-          <w:sz w:val="20"/>
-          <w:szCs w:val="20"/>
+          <w:rFonts w:ascii="Times New Roman" w:eastAsia="Times New Roman" w:hAnsi="Times New Roman" w:cs="Times New Roman"/>
+          <w:sz w:val="24"/>
+          <w:szCs w:val="24"/>
         </w:rPr>
       </w:pPr>
       <w:proofErr w:type="spellStart"/>
       <w:r>
         <w:rPr>
-          <w:rFonts w:ascii="Courier New" w:eastAsia="Times New Roman" w:hAnsi="Courier New" w:cs="Courier New"/>
-          <w:sz w:val="20"/>
-          <w:szCs w:val="20"/>
+          <w:rFonts w:ascii="Times New Roman" w:eastAsia="Times New Roman" w:hAnsi="Times New Roman" w:cs="Times New Roman"/>
+          <w:sz w:val="24"/>
+          <w:szCs w:val="24"/>
         </w:rPr>
         <w:t>sales_rep</w:t>
       </w:r>
       <w:proofErr w:type="spellEnd"/>
       <w:r>
         <w:rPr>
-          <w:rFonts w:ascii="Courier New" w:eastAsia="Times New Roman" w:hAnsi="Courier New" w:cs="Courier New"/>
-          <w:sz w:val="20"/>
-          <w:szCs w:val="20"/>
+          <w:rFonts w:ascii="Times New Roman" w:eastAsia="Times New Roman" w:hAnsi="Times New Roman" w:cs="Times New Roman"/>
+          <w:sz w:val="24"/>
+          <w:szCs w:val="24"/>
         </w:rPr>
         <w:br/>
       </w:r>
       <w:proofErr w:type="spellStart"/>
       <w:r>
         <w:rPr>
-          <w:rFonts w:ascii="Courier New" w:eastAsia="Times New Roman" w:hAnsi="Courier New" w:cs="Courier New"/>
-          <w:sz w:val="20"/>
-          <w:szCs w:val="20"/>
+          <w:rFonts w:ascii="Times New Roman" w:eastAsia="Times New Roman" w:hAnsi="Times New Roman" w:cs="Times New Roman"/>
+          <w:sz w:val="24"/>
+          <w:szCs w:val="24"/>
         </w:rPr>
         <w:t>deal_size</w:t>
       </w:r>
       <w:proofErr w:type="spellEnd"/>
       <w:r>
         <w:rPr>
-          <w:rFonts w:ascii="Courier New" w:eastAsia="Times New Roman" w:hAnsi="Courier New" w:cs="Courier New"/>
-          <w:sz w:val="20"/>
-          <w:szCs w:val="20"/>
+          <w:rFonts w:ascii="Times New Roman" w:eastAsia="Times New Roman" w:hAnsi="Times New Roman" w:cs="Times New Roman"/>
+          <w:sz w:val="24"/>
+          <w:szCs w:val="24"/>
         </w:rPr>
         <w:br/>
         <w:t>stage</w:t>
       </w:r>
       <w:r>
         <w:rPr>
-          <w:rFonts w:ascii="Courier New" w:eastAsia="Times New Roman" w:hAnsi="Courier New" w:cs="Courier New"/>
-          <w:sz w:val="20"/>
-          <w:szCs w:val="20"/>
+          <w:rFonts w:ascii="Times New Roman" w:eastAsia="Times New Roman" w:hAnsi="Times New Roman" w:cs="Times New Roman"/>
+          <w:sz w:val="24"/>
+          <w:szCs w:val="24"/>
         </w:rPr>
         <w:br/>
       </w:r>
       <w:proofErr w:type="spellStart"/>
       <w:r>
         <w:rPr>
-          <w:rFonts w:ascii="Courier New" w:eastAsia="Times New Roman" w:hAnsi="Courier New" w:cs="Courier New"/>
-          <w:sz w:val="20"/>
-          <w:szCs w:val="20"/>
+          <w:rFonts w:ascii="Times New Roman" w:eastAsia="Times New Roman" w:hAnsi="Times New Roman" w:cs="Times New Roman"/>
+          <w:sz w:val="24"/>
+          <w:szCs w:val="24"/>
         </w:rPr>
         <w:t>close_date</w:t>
       </w:r>
@@ -1551,17 +1568,17 @@
           <w:rFonts w:ascii="Times New Roman" w:eastAsia="Times New Roman" w:hAnsi="Times New Roman" w:cs="Times New Roman"/>
           <w:b/>
           <w:bCs/>
-          <w:sz w:val="27"/>
-          <w:szCs w:val="27"/>
-        </w:rPr>
-      </w:pPr>
-      <w:r>
-        <w:rPr>
-          <w:rFonts w:ascii="Times New Roman" w:eastAsia="Times New Roman" w:hAnsi="Times New Roman" w:cs="Times New Roman"/>
-          <w:b/>
-          <w:bCs/>
-          <w:sz w:val="27"/>
-          <w:szCs w:val="27"/>
+          <w:sz w:val="24"/>
+          <w:szCs w:val="24"/>
+        </w:rPr>
+      </w:pPr>
+      <w:r>
+        <w:rPr>
+          <w:rFonts w:ascii="Times New Roman" w:eastAsia="Times New Roman" w:hAnsi="Times New Roman" w:cs="Times New Roman"/>
+          <w:b/>
+          <w:bCs/>
+          <w:sz w:val="24"/>
+          <w:szCs w:val="24"/>
         </w:rPr>
         <w:t>Marketing</w:t>
       </w:r>
@@ -1588,42 +1605,42 @@
         </w:tabs>
         <w:spacing w:after="0" w:line="240" w:lineRule="auto"/>
         <w:rPr>
-          <w:rFonts w:ascii="Courier New" w:eastAsia="Times New Roman" w:hAnsi="Courier New" w:cs="Courier New"/>
-          <w:sz w:val="20"/>
-          <w:szCs w:val="20"/>
-        </w:rPr>
-      </w:pPr>
-      <w:r>
-        <w:rPr>
-          <w:rFonts w:ascii="Courier New" w:eastAsia="Times New Roman" w:hAnsi="Courier New" w:cs="Courier New"/>
-          <w:sz w:val="20"/>
-          <w:szCs w:val="20"/>
+          <w:rFonts w:ascii="Times New Roman" w:eastAsia="Times New Roman" w:hAnsi="Times New Roman" w:cs="Times New Roman"/>
+          <w:sz w:val="24"/>
+          <w:szCs w:val="24"/>
+        </w:rPr>
+      </w:pPr>
+      <w:r>
+        <w:rPr>
+          <w:rFonts w:ascii="Times New Roman" w:eastAsia="Times New Roman" w:hAnsi="Times New Roman" w:cs="Times New Roman"/>
+          <w:sz w:val="24"/>
+          <w:szCs w:val="24"/>
         </w:rPr>
         <w:t>channel</w:t>
       </w:r>
       <w:r>
         <w:rPr>
-          <w:rFonts w:ascii="Courier New" w:eastAsia="Times New Roman" w:hAnsi="Courier New" w:cs="Courier New"/>
-          <w:sz w:val="20"/>
-          <w:szCs w:val="20"/>
+          <w:rFonts w:ascii="Times New Roman" w:eastAsia="Times New Roman" w:hAnsi="Times New Roman" w:cs="Times New Roman"/>
+          <w:sz w:val="24"/>
+          <w:szCs w:val="24"/>
         </w:rPr>
         <w:br/>
         <w:t>spend</w:t>
       </w:r>
       <w:r>
         <w:rPr>
-          <w:rFonts w:ascii="Courier New" w:eastAsia="Times New Roman" w:hAnsi="Courier New" w:cs="Courier New"/>
-          <w:sz w:val="20"/>
-          <w:szCs w:val="20"/>
+          <w:rFonts w:ascii="Times New Roman" w:eastAsia="Times New Roman" w:hAnsi="Times New Roman" w:cs="Times New Roman"/>
+          <w:sz w:val="24"/>
+          <w:szCs w:val="24"/>
         </w:rPr>
         <w:br/>
         <w:t>leads</w:t>
       </w:r>
       <w:r>
         <w:rPr>
-          <w:rFonts w:ascii="Courier New" w:eastAsia="Times New Roman" w:hAnsi="Courier New" w:cs="Courier New"/>
-          <w:sz w:val="20"/>
-          <w:szCs w:val="20"/>
+          <w:rFonts w:ascii="Times New Roman" w:eastAsia="Times New Roman" w:hAnsi="Times New Roman" w:cs="Times New Roman"/>
+          <w:sz w:val="24"/>
+          <w:szCs w:val="24"/>
         </w:rPr>
         <w:br/>
         <w:t>conversions</w:t>
@@ -1637,17 +1654,17 @@
           <w:rFonts w:ascii="Times New Roman" w:eastAsia="Times New Roman" w:hAnsi="Times New Roman" w:cs="Times New Roman"/>
           <w:b/>
           <w:bCs/>
-          <w:sz w:val="27"/>
-          <w:szCs w:val="27"/>
-        </w:rPr>
-      </w:pPr>
-      <w:r>
-        <w:rPr>
-          <w:rFonts w:ascii="Times New Roman" w:eastAsia="Times New Roman" w:hAnsi="Times New Roman" w:cs="Times New Roman"/>
-          <w:b/>
-          <w:bCs/>
-          <w:sz w:val="27"/>
-          <w:szCs w:val="27"/>
+          <w:sz w:val="24"/>
+          <w:szCs w:val="24"/>
+        </w:rPr>
+      </w:pPr>
+      <w:r>
+        <w:rPr>
+          <w:rFonts w:ascii="Times New Roman" w:eastAsia="Times New Roman" w:hAnsi="Times New Roman" w:cs="Times New Roman"/>
+          <w:b/>
+          <w:bCs/>
+          <w:sz w:val="24"/>
+          <w:szCs w:val="24"/>
         </w:rPr>
         <w:t>Product Usage</w:t>
       </w:r>
@@ -1674,53 +1691,53 @@
         </w:tabs>
         <w:spacing w:after="0" w:line="240" w:lineRule="auto"/>
         <w:rPr>
-          <w:rFonts w:ascii="Courier New" w:eastAsia="Times New Roman" w:hAnsi="Courier New" w:cs="Courier New"/>
-          <w:sz w:val="20"/>
-          <w:szCs w:val="20"/>
+          <w:rFonts w:ascii="Times New Roman" w:eastAsia="Times New Roman" w:hAnsi="Times New Roman" w:cs="Times New Roman"/>
+          <w:sz w:val="24"/>
+          <w:szCs w:val="24"/>
         </w:rPr>
       </w:pPr>
       <w:proofErr w:type="spellStart"/>
       <w:r>
         <w:rPr>
-          <w:rFonts w:ascii="Courier New" w:eastAsia="Times New Roman" w:hAnsi="Courier New" w:cs="Courier New"/>
-          <w:sz w:val="20"/>
-          <w:szCs w:val="20"/>
+          <w:rFonts w:ascii="Times New Roman" w:eastAsia="Times New Roman" w:hAnsi="Times New Roman" w:cs="Times New Roman"/>
+          <w:sz w:val="24"/>
+          <w:szCs w:val="24"/>
         </w:rPr>
         <w:t>customer_id</w:t>
       </w:r>
       <w:proofErr w:type="spellEnd"/>
       <w:r>
         <w:rPr>
-          <w:rFonts w:ascii="Courier New" w:eastAsia="Times New Roman" w:hAnsi="Courier New" w:cs="Courier New"/>
-          <w:sz w:val="20"/>
-          <w:szCs w:val="20"/>
+          <w:rFonts w:ascii="Times New Roman" w:eastAsia="Times New Roman" w:hAnsi="Times New Roman" w:cs="Times New Roman"/>
+          <w:sz w:val="24"/>
+          <w:szCs w:val="24"/>
         </w:rPr>
         <w:br/>
         <w:t>logins</w:t>
       </w:r>
       <w:r>
         <w:rPr>
-          <w:rFonts w:ascii="Courier New" w:eastAsia="Times New Roman" w:hAnsi="Courier New" w:cs="Courier New"/>
-          <w:sz w:val="20"/>
-          <w:szCs w:val="20"/>
+          <w:rFonts w:ascii="Times New Roman" w:eastAsia="Times New Roman" w:hAnsi="Times New Roman" w:cs="Times New Roman"/>
+          <w:sz w:val="24"/>
+          <w:szCs w:val="24"/>
         </w:rPr>
         <w:br/>
       </w:r>
       <w:proofErr w:type="spellStart"/>
       <w:r>
         <w:rPr>
-          <w:rFonts w:ascii="Courier New" w:eastAsia="Times New Roman" w:hAnsi="Courier New" w:cs="Courier New"/>
-          <w:sz w:val="20"/>
-          <w:szCs w:val="20"/>
+          <w:rFonts w:ascii="Times New Roman" w:eastAsia="Times New Roman" w:hAnsi="Times New Roman" w:cs="Times New Roman"/>
+          <w:sz w:val="24"/>
+          <w:szCs w:val="24"/>
         </w:rPr>
         <w:t>feature_usage</w:t>
       </w:r>
       <w:proofErr w:type="spellEnd"/>
       <w:r>
         <w:rPr>
-          <w:rFonts w:ascii="Courier New" w:eastAsia="Times New Roman" w:hAnsi="Courier New" w:cs="Courier New"/>
-          <w:sz w:val="20"/>
-          <w:szCs w:val="20"/>
+          <w:rFonts w:ascii="Times New Roman" w:eastAsia="Times New Roman" w:hAnsi="Times New Roman" w:cs="Times New Roman"/>
+          <w:sz w:val="24"/>
+          <w:szCs w:val="24"/>
         </w:rPr>
         <w:br/>
         <w:t>sessions</w:t>
@@ -1755,8 +1772,8 @@
           <w:b/>
           <w:bCs/>
           <w:kern w:val="36"/>
-          <w:sz w:val="48"/>
-          <w:szCs w:val="48"/>
+          <w:sz w:val="24"/>
+          <w:szCs w:val="24"/>
         </w:rPr>
       </w:pPr>
       <w:r>
@@ -1765,8 +1782,8 @@
           <w:b/>
           <w:bCs/>
           <w:kern w:val="36"/>
-          <w:sz w:val="48"/>
-          <w:szCs w:val="48"/>
+          <w:sz w:val="24"/>
+          <w:szCs w:val="24"/>
         </w:rPr>
         <w:t xml:space="preserve">Phase 2 — </w:t>
       </w:r>
@@ -1777,8 +1794,8 @@
           <w:b/>
           <w:bCs/>
           <w:kern w:val="36"/>
-          <w:sz w:val="48"/>
-          <w:szCs w:val="48"/>
+          <w:sz w:val="24"/>
+          <w:szCs w:val="24"/>
         </w:rPr>
         <w:t>Databricks</w:t>
       </w:r>
@@ -1799,6 +1816,7 @@
           <w:sz w:val="24"/>
           <w:szCs w:val="24"/>
         </w:rPr>
+        <w:lastRenderedPageBreak/>
         <w:t xml:space="preserve">Recruiters want to see </w:t>
       </w:r>
       <w:proofErr w:type="spellStart"/>
@@ -1846,19 +1864,18 @@
           <w:rFonts w:ascii="Times New Roman" w:eastAsia="Times New Roman" w:hAnsi="Times New Roman" w:cs="Times New Roman"/>
           <w:b/>
           <w:bCs/>
-          <w:sz w:val="27"/>
-          <w:szCs w:val="27"/>
-        </w:rPr>
-      </w:pPr>
-      <w:r>
-        <w:rPr>
-          <w:rFonts w:ascii="Times New Roman" w:eastAsia="Times New Roman" w:hAnsi="Times New Roman" w:cs="Times New Roman"/>
-          <w:b/>
-          <w:bCs/>
-          <w:sz w:val="27"/>
-          <w:szCs w:val="27"/>
-        </w:rPr>
-        <w:lastRenderedPageBreak/>
+          <w:sz w:val="24"/>
+          <w:szCs w:val="24"/>
+        </w:rPr>
+      </w:pPr>
+      <w:r>
+        <w:rPr>
+          <w:rFonts w:ascii="Times New Roman" w:eastAsia="Times New Roman" w:hAnsi="Times New Roman" w:cs="Times New Roman"/>
+          <w:b/>
+          <w:bCs/>
+          <w:sz w:val="24"/>
+          <w:szCs w:val="24"/>
+        </w:rPr>
         <w:t>Bronze Layer</w:t>
       </w:r>
     </w:p>
@@ -1902,51 +1919,51 @@
         </w:tabs>
         <w:spacing w:after="0" w:line="240" w:lineRule="auto"/>
         <w:rPr>
-          <w:rFonts w:ascii="Courier New" w:eastAsia="Times New Roman" w:hAnsi="Courier New" w:cs="Courier New"/>
-          <w:sz w:val="20"/>
-          <w:szCs w:val="20"/>
-        </w:rPr>
-      </w:pPr>
-      <w:r>
-        <w:rPr>
-          <w:rFonts w:ascii="Courier New" w:eastAsia="Times New Roman" w:hAnsi="Courier New" w:cs="Courier New"/>
-          <w:sz w:val="20"/>
-          <w:szCs w:val="20"/>
+          <w:rFonts w:ascii="Times New Roman" w:eastAsia="Times New Roman" w:hAnsi="Times New Roman" w:cs="Times New Roman"/>
+          <w:sz w:val="24"/>
+          <w:szCs w:val="24"/>
+        </w:rPr>
+      </w:pPr>
+      <w:r>
+        <w:rPr>
+          <w:rFonts w:ascii="Times New Roman" w:eastAsia="Times New Roman" w:hAnsi="Times New Roman" w:cs="Times New Roman"/>
+          <w:sz w:val="24"/>
+          <w:szCs w:val="24"/>
         </w:rPr>
         <w:t>customers</w:t>
       </w:r>
       <w:r>
         <w:rPr>
-          <w:rFonts w:ascii="Courier New" w:eastAsia="Times New Roman" w:hAnsi="Courier New" w:cs="Courier New"/>
-          <w:sz w:val="20"/>
-          <w:szCs w:val="20"/>
+          <w:rFonts w:ascii="Times New Roman" w:eastAsia="Times New Roman" w:hAnsi="Times New Roman" w:cs="Times New Roman"/>
+          <w:sz w:val="24"/>
+          <w:szCs w:val="24"/>
         </w:rPr>
         <w:br/>
         <w:t>sales</w:t>
       </w:r>
       <w:r>
         <w:rPr>
-          <w:rFonts w:ascii="Courier New" w:eastAsia="Times New Roman" w:hAnsi="Courier New" w:cs="Courier New"/>
-          <w:sz w:val="20"/>
-          <w:szCs w:val="20"/>
+          <w:rFonts w:ascii="Times New Roman" w:eastAsia="Times New Roman" w:hAnsi="Times New Roman" w:cs="Times New Roman"/>
+          <w:sz w:val="24"/>
+          <w:szCs w:val="24"/>
         </w:rPr>
         <w:br/>
         <w:t>marketing</w:t>
       </w:r>
       <w:r>
         <w:rPr>
-          <w:rFonts w:ascii="Courier New" w:eastAsia="Times New Roman" w:hAnsi="Courier New" w:cs="Courier New"/>
-          <w:sz w:val="20"/>
-          <w:szCs w:val="20"/>
+          <w:rFonts w:ascii="Times New Roman" w:eastAsia="Times New Roman" w:hAnsi="Times New Roman" w:cs="Times New Roman"/>
+          <w:sz w:val="24"/>
+          <w:szCs w:val="24"/>
         </w:rPr>
         <w:br/>
         <w:t>usage</w:t>
       </w:r>
       <w:r>
         <w:rPr>
-          <w:rFonts w:ascii="Courier New" w:eastAsia="Times New Roman" w:hAnsi="Courier New" w:cs="Courier New"/>
-          <w:sz w:val="20"/>
-          <w:szCs w:val="20"/>
+          <w:rFonts w:ascii="Times New Roman" w:eastAsia="Times New Roman" w:hAnsi="Times New Roman" w:cs="Times New Roman"/>
+          <w:sz w:val="24"/>
+          <w:szCs w:val="24"/>
         </w:rPr>
         <w:br/>
         <w:t>revenue</w:t>
@@ -1960,17 +1977,17 @@
           <w:rFonts w:ascii="Times New Roman" w:eastAsia="Times New Roman" w:hAnsi="Times New Roman" w:cs="Times New Roman"/>
           <w:b/>
           <w:bCs/>
-          <w:sz w:val="27"/>
-          <w:szCs w:val="27"/>
-        </w:rPr>
-      </w:pPr>
-      <w:r>
-        <w:rPr>
-          <w:rFonts w:ascii="Times New Roman" w:eastAsia="Times New Roman" w:hAnsi="Times New Roman" w:cs="Times New Roman"/>
-          <w:b/>
-          <w:bCs/>
-          <w:sz w:val="27"/>
-          <w:szCs w:val="27"/>
+          <w:sz w:val="24"/>
+          <w:szCs w:val="24"/>
+        </w:rPr>
+      </w:pPr>
+      <w:r>
+        <w:rPr>
+          <w:rFonts w:ascii="Times New Roman" w:eastAsia="Times New Roman" w:hAnsi="Times New Roman" w:cs="Times New Roman"/>
+          <w:b/>
+          <w:bCs/>
+          <w:sz w:val="24"/>
+          <w:szCs w:val="24"/>
         </w:rPr>
         <w:t>Silver Layer</w:t>
       </w:r>
@@ -2015,33 +2032,33 @@
         </w:tabs>
         <w:spacing w:after="0" w:line="240" w:lineRule="auto"/>
         <w:rPr>
-          <w:rFonts w:ascii="Courier New" w:eastAsia="Times New Roman" w:hAnsi="Courier New" w:cs="Courier New"/>
-          <w:sz w:val="20"/>
-          <w:szCs w:val="20"/>
-        </w:rPr>
-      </w:pPr>
-      <w:r>
-        <w:rPr>
-          <w:rFonts w:ascii="Courier New" w:eastAsia="Times New Roman" w:hAnsi="Courier New" w:cs="Courier New"/>
-          <w:sz w:val="20"/>
-          <w:szCs w:val="20"/>
+          <w:rFonts w:ascii="Times New Roman" w:eastAsia="Times New Roman" w:hAnsi="Times New Roman" w:cs="Times New Roman"/>
+          <w:sz w:val="24"/>
+          <w:szCs w:val="24"/>
+        </w:rPr>
+      </w:pPr>
+      <w:r>
+        <w:rPr>
+          <w:rFonts w:ascii="Times New Roman" w:eastAsia="Times New Roman" w:hAnsi="Times New Roman" w:cs="Times New Roman"/>
+          <w:sz w:val="24"/>
+          <w:szCs w:val="24"/>
         </w:rPr>
         <w:t>null handling</w:t>
       </w:r>
       <w:r>
         <w:rPr>
-          <w:rFonts w:ascii="Courier New" w:eastAsia="Times New Roman" w:hAnsi="Courier New" w:cs="Courier New"/>
-          <w:sz w:val="20"/>
-          <w:szCs w:val="20"/>
+          <w:rFonts w:ascii="Times New Roman" w:eastAsia="Times New Roman" w:hAnsi="Times New Roman" w:cs="Times New Roman"/>
+          <w:sz w:val="24"/>
+          <w:szCs w:val="24"/>
         </w:rPr>
         <w:br/>
         <w:t>standardization</w:t>
       </w:r>
       <w:r>
         <w:rPr>
-          <w:rFonts w:ascii="Courier New" w:eastAsia="Times New Roman" w:hAnsi="Courier New" w:cs="Courier New"/>
-          <w:sz w:val="20"/>
-          <w:szCs w:val="20"/>
+          <w:rFonts w:ascii="Times New Roman" w:eastAsia="Times New Roman" w:hAnsi="Times New Roman" w:cs="Times New Roman"/>
+          <w:sz w:val="24"/>
+          <w:szCs w:val="24"/>
         </w:rPr>
         <w:br/>
         <w:t>deduplication</w:t>
@@ -2055,17 +2072,17 @@
           <w:rFonts w:ascii="Times New Roman" w:eastAsia="Times New Roman" w:hAnsi="Times New Roman" w:cs="Times New Roman"/>
           <w:b/>
           <w:bCs/>
-          <w:sz w:val="27"/>
-          <w:szCs w:val="27"/>
-        </w:rPr>
-      </w:pPr>
-      <w:r>
-        <w:rPr>
-          <w:rFonts w:ascii="Times New Roman" w:eastAsia="Times New Roman" w:hAnsi="Times New Roman" w:cs="Times New Roman"/>
-          <w:b/>
-          <w:bCs/>
-          <w:sz w:val="27"/>
-          <w:szCs w:val="27"/>
+          <w:sz w:val="24"/>
+          <w:szCs w:val="24"/>
+        </w:rPr>
+      </w:pPr>
+      <w:r>
+        <w:rPr>
+          <w:rFonts w:ascii="Times New Roman" w:eastAsia="Times New Roman" w:hAnsi="Times New Roman" w:cs="Times New Roman"/>
+          <w:b/>
+          <w:bCs/>
+          <w:sz w:val="24"/>
+          <w:szCs w:val="24"/>
         </w:rPr>
         <w:t>Gold Layer</w:t>
       </w:r>
@@ -2110,71 +2127,71 @@
         </w:tabs>
         <w:spacing w:after="0" w:line="240" w:lineRule="auto"/>
         <w:rPr>
-          <w:rFonts w:ascii="Courier New" w:eastAsia="Times New Roman" w:hAnsi="Courier New" w:cs="Courier New"/>
-          <w:sz w:val="20"/>
-          <w:szCs w:val="20"/>
+          <w:rFonts w:ascii="Times New Roman" w:eastAsia="Times New Roman" w:hAnsi="Times New Roman" w:cs="Times New Roman"/>
+          <w:sz w:val="24"/>
+          <w:szCs w:val="24"/>
         </w:rPr>
       </w:pPr>
       <w:proofErr w:type="spellStart"/>
       <w:r>
         <w:rPr>
-          <w:rFonts w:ascii="Courier New" w:eastAsia="Times New Roman" w:hAnsi="Courier New" w:cs="Courier New"/>
-          <w:sz w:val="20"/>
-          <w:szCs w:val="20"/>
+          <w:rFonts w:ascii="Times New Roman" w:eastAsia="Times New Roman" w:hAnsi="Times New Roman" w:cs="Times New Roman"/>
+          <w:sz w:val="24"/>
+          <w:szCs w:val="24"/>
         </w:rPr>
         <w:t>customer_metrics</w:t>
       </w:r>
       <w:proofErr w:type="spellEnd"/>
       <w:r>
         <w:rPr>
-          <w:rFonts w:ascii="Courier New" w:eastAsia="Times New Roman" w:hAnsi="Courier New" w:cs="Courier New"/>
-          <w:sz w:val="20"/>
-          <w:szCs w:val="20"/>
+          <w:rFonts w:ascii="Times New Roman" w:eastAsia="Times New Roman" w:hAnsi="Times New Roman" w:cs="Times New Roman"/>
+          <w:sz w:val="24"/>
+          <w:szCs w:val="24"/>
         </w:rPr>
         <w:br/>
       </w:r>
       <w:proofErr w:type="spellStart"/>
       <w:r>
         <w:rPr>
-          <w:rFonts w:ascii="Courier New" w:eastAsia="Times New Roman" w:hAnsi="Courier New" w:cs="Courier New"/>
-          <w:sz w:val="20"/>
-          <w:szCs w:val="20"/>
+          <w:rFonts w:ascii="Times New Roman" w:eastAsia="Times New Roman" w:hAnsi="Times New Roman" w:cs="Times New Roman"/>
+          <w:sz w:val="24"/>
+          <w:szCs w:val="24"/>
         </w:rPr>
         <w:t>revenue_metrics</w:t>
       </w:r>
       <w:proofErr w:type="spellEnd"/>
       <w:r>
         <w:rPr>
-          <w:rFonts w:ascii="Courier New" w:eastAsia="Times New Roman" w:hAnsi="Courier New" w:cs="Courier New"/>
-          <w:sz w:val="20"/>
-          <w:szCs w:val="20"/>
+          <w:rFonts w:ascii="Times New Roman" w:eastAsia="Times New Roman" w:hAnsi="Times New Roman" w:cs="Times New Roman"/>
+          <w:sz w:val="24"/>
+          <w:szCs w:val="24"/>
         </w:rPr>
         <w:br/>
       </w:r>
       <w:proofErr w:type="spellStart"/>
       <w:r>
         <w:rPr>
-          <w:rFonts w:ascii="Courier New" w:eastAsia="Times New Roman" w:hAnsi="Courier New" w:cs="Courier New"/>
-          <w:sz w:val="20"/>
-          <w:szCs w:val="20"/>
+          <w:rFonts w:ascii="Times New Roman" w:eastAsia="Times New Roman" w:hAnsi="Times New Roman" w:cs="Times New Roman"/>
+          <w:sz w:val="24"/>
+          <w:szCs w:val="24"/>
         </w:rPr>
         <w:t>marketing_metrics</w:t>
       </w:r>
       <w:proofErr w:type="spellEnd"/>
       <w:r>
         <w:rPr>
-          <w:rFonts w:ascii="Courier New" w:eastAsia="Times New Roman" w:hAnsi="Courier New" w:cs="Courier New"/>
-          <w:sz w:val="20"/>
-          <w:szCs w:val="20"/>
+          <w:rFonts w:ascii="Times New Roman" w:eastAsia="Times New Roman" w:hAnsi="Times New Roman" w:cs="Times New Roman"/>
+          <w:sz w:val="24"/>
+          <w:szCs w:val="24"/>
         </w:rPr>
         <w:br/>
       </w:r>
       <w:proofErr w:type="spellStart"/>
       <w:r>
         <w:rPr>
-          <w:rFonts w:ascii="Courier New" w:eastAsia="Times New Roman" w:hAnsi="Courier New" w:cs="Courier New"/>
-          <w:sz w:val="20"/>
-          <w:szCs w:val="20"/>
+          <w:rFonts w:ascii="Times New Roman" w:eastAsia="Times New Roman" w:hAnsi="Times New Roman" w:cs="Times New Roman"/>
+          <w:sz w:val="24"/>
+          <w:szCs w:val="24"/>
         </w:rPr>
         <w:t>sales_metrics</w:t>
       </w:r>
@@ -2209,8 +2226,8 @@
           <w:b/>
           <w:bCs/>
           <w:kern w:val="36"/>
-          <w:sz w:val="48"/>
-          <w:szCs w:val="48"/>
+          <w:sz w:val="24"/>
+          <w:szCs w:val="24"/>
         </w:rPr>
       </w:pPr>
       <w:r>
@@ -2219,8 +2236,8 @@
           <w:b/>
           <w:bCs/>
           <w:kern w:val="36"/>
-          <w:sz w:val="48"/>
-          <w:szCs w:val="48"/>
+          <w:sz w:val="24"/>
+          <w:szCs w:val="24"/>
         </w:rPr>
         <w:t>Phase 3 — Snowflake</w:t>
       </w:r>
@@ -2313,17 +2330,17 @@
           <w:rFonts w:ascii="Times New Roman" w:eastAsia="Times New Roman" w:hAnsi="Times New Roman" w:cs="Times New Roman"/>
           <w:b/>
           <w:bCs/>
-          <w:sz w:val="27"/>
-          <w:szCs w:val="27"/>
-        </w:rPr>
-      </w:pPr>
-      <w:r>
-        <w:rPr>
-          <w:rFonts w:ascii="Times New Roman" w:eastAsia="Times New Roman" w:hAnsi="Times New Roman" w:cs="Times New Roman"/>
-          <w:b/>
-          <w:bCs/>
-          <w:sz w:val="27"/>
-          <w:szCs w:val="27"/>
+          <w:sz w:val="24"/>
+          <w:szCs w:val="24"/>
+        </w:rPr>
+      </w:pPr>
+      <w:r>
+        <w:rPr>
+          <w:rFonts w:ascii="Times New Roman" w:eastAsia="Times New Roman" w:hAnsi="Times New Roman" w:cs="Times New Roman"/>
+          <w:b/>
+          <w:bCs/>
+          <w:sz w:val="24"/>
+          <w:szCs w:val="24"/>
         </w:rPr>
         <w:t>Fact Tables</w:t>
       </w:r>
@@ -2350,71 +2367,71 @@
         </w:tabs>
         <w:spacing w:after="0" w:line="240" w:lineRule="auto"/>
         <w:rPr>
-          <w:rFonts w:ascii="Courier New" w:eastAsia="Times New Roman" w:hAnsi="Courier New" w:cs="Courier New"/>
-          <w:sz w:val="20"/>
-          <w:szCs w:val="20"/>
+          <w:rFonts w:ascii="Times New Roman" w:eastAsia="Times New Roman" w:hAnsi="Times New Roman" w:cs="Times New Roman"/>
+          <w:sz w:val="24"/>
+          <w:szCs w:val="24"/>
         </w:rPr>
       </w:pPr>
       <w:proofErr w:type="spellStart"/>
       <w:r>
         <w:rPr>
-          <w:rFonts w:ascii="Courier New" w:eastAsia="Times New Roman" w:hAnsi="Courier New" w:cs="Courier New"/>
-          <w:sz w:val="20"/>
-          <w:szCs w:val="20"/>
+          <w:rFonts w:ascii="Times New Roman" w:eastAsia="Times New Roman" w:hAnsi="Times New Roman" w:cs="Times New Roman"/>
+          <w:sz w:val="24"/>
+          <w:szCs w:val="24"/>
         </w:rPr>
         <w:t>fact_revenue</w:t>
       </w:r>
       <w:proofErr w:type="spellEnd"/>
       <w:r>
         <w:rPr>
-          <w:rFonts w:ascii="Courier New" w:eastAsia="Times New Roman" w:hAnsi="Courier New" w:cs="Courier New"/>
-          <w:sz w:val="20"/>
-          <w:szCs w:val="20"/>
+          <w:rFonts w:ascii="Times New Roman" w:eastAsia="Times New Roman" w:hAnsi="Times New Roman" w:cs="Times New Roman"/>
+          <w:sz w:val="24"/>
+          <w:szCs w:val="24"/>
         </w:rPr>
         <w:br/>
       </w:r>
       <w:proofErr w:type="spellStart"/>
       <w:r>
         <w:rPr>
-          <w:rFonts w:ascii="Courier New" w:eastAsia="Times New Roman" w:hAnsi="Courier New" w:cs="Courier New"/>
-          <w:sz w:val="20"/>
-          <w:szCs w:val="20"/>
+          <w:rFonts w:ascii="Times New Roman" w:eastAsia="Times New Roman" w:hAnsi="Times New Roman" w:cs="Times New Roman"/>
+          <w:sz w:val="24"/>
+          <w:szCs w:val="24"/>
         </w:rPr>
         <w:t>fact_sales</w:t>
       </w:r>
       <w:proofErr w:type="spellEnd"/>
       <w:r>
         <w:rPr>
-          <w:rFonts w:ascii="Courier New" w:eastAsia="Times New Roman" w:hAnsi="Courier New" w:cs="Courier New"/>
-          <w:sz w:val="20"/>
-          <w:szCs w:val="20"/>
+          <w:rFonts w:ascii="Times New Roman" w:eastAsia="Times New Roman" w:hAnsi="Times New Roman" w:cs="Times New Roman"/>
+          <w:sz w:val="24"/>
+          <w:szCs w:val="24"/>
         </w:rPr>
         <w:br/>
       </w:r>
       <w:proofErr w:type="spellStart"/>
       <w:r>
         <w:rPr>
-          <w:rFonts w:ascii="Courier New" w:eastAsia="Times New Roman" w:hAnsi="Courier New" w:cs="Courier New"/>
-          <w:sz w:val="20"/>
-          <w:szCs w:val="20"/>
+          <w:rFonts w:ascii="Times New Roman" w:eastAsia="Times New Roman" w:hAnsi="Times New Roman" w:cs="Times New Roman"/>
+          <w:sz w:val="24"/>
+          <w:szCs w:val="24"/>
         </w:rPr>
         <w:t>fact_marketing</w:t>
       </w:r>
       <w:proofErr w:type="spellEnd"/>
       <w:r>
         <w:rPr>
-          <w:rFonts w:ascii="Courier New" w:eastAsia="Times New Roman" w:hAnsi="Courier New" w:cs="Courier New"/>
-          <w:sz w:val="20"/>
-          <w:szCs w:val="20"/>
+          <w:rFonts w:ascii="Times New Roman" w:eastAsia="Times New Roman" w:hAnsi="Times New Roman" w:cs="Times New Roman"/>
+          <w:sz w:val="24"/>
+          <w:szCs w:val="24"/>
         </w:rPr>
         <w:br/>
       </w:r>
       <w:proofErr w:type="spellStart"/>
       <w:r>
         <w:rPr>
-          <w:rFonts w:ascii="Courier New" w:eastAsia="Times New Roman" w:hAnsi="Courier New" w:cs="Courier New"/>
-          <w:sz w:val="20"/>
-          <w:szCs w:val="20"/>
+          <w:rFonts w:ascii="Times New Roman" w:eastAsia="Times New Roman" w:hAnsi="Times New Roman" w:cs="Times New Roman"/>
+          <w:sz w:val="24"/>
+          <w:szCs w:val="24"/>
         </w:rPr>
         <w:t>fact_usage</w:t>
       </w:r>
@@ -2428,18 +2445,19 @@
           <w:rFonts w:ascii="Times New Roman" w:eastAsia="Times New Roman" w:hAnsi="Times New Roman" w:cs="Times New Roman"/>
           <w:b/>
           <w:bCs/>
-          <w:sz w:val="27"/>
-          <w:szCs w:val="27"/>
-        </w:rPr>
-      </w:pPr>
-      <w:r>
-        <w:rPr>
-          <w:rFonts w:ascii="Times New Roman" w:eastAsia="Times New Roman" w:hAnsi="Times New Roman" w:cs="Times New Roman"/>
-          <w:b/>
-          <w:bCs/>
-          <w:sz w:val="27"/>
-          <w:szCs w:val="27"/>
-        </w:rPr>
+          <w:sz w:val="24"/>
+          <w:szCs w:val="24"/>
+        </w:rPr>
+      </w:pPr>
+      <w:r>
+        <w:rPr>
+          <w:rFonts w:ascii="Times New Roman" w:eastAsia="Times New Roman" w:hAnsi="Times New Roman" w:cs="Times New Roman"/>
+          <w:b/>
+          <w:bCs/>
+          <w:sz w:val="24"/>
+          <w:szCs w:val="24"/>
+        </w:rPr>
+        <w:lastRenderedPageBreak/>
         <w:t>Dimension Tables</w:t>
       </w:r>
     </w:p>
@@ -2465,71 +2483,71 @@
         </w:tabs>
         <w:spacing w:after="0" w:line="240" w:lineRule="auto"/>
         <w:rPr>
-          <w:rFonts w:ascii="Courier New" w:eastAsia="Times New Roman" w:hAnsi="Courier New" w:cs="Courier New"/>
-          <w:sz w:val="20"/>
-          <w:szCs w:val="20"/>
+          <w:rFonts w:ascii="Times New Roman" w:eastAsia="Times New Roman" w:hAnsi="Times New Roman" w:cs="Times New Roman"/>
+          <w:sz w:val="24"/>
+          <w:szCs w:val="24"/>
         </w:rPr>
       </w:pPr>
       <w:proofErr w:type="spellStart"/>
       <w:r>
         <w:rPr>
-          <w:rFonts w:ascii="Courier New" w:eastAsia="Times New Roman" w:hAnsi="Courier New" w:cs="Courier New"/>
-          <w:sz w:val="20"/>
-          <w:szCs w:val="20"/>
+          <w:rFonts w:ascii="Times New Roman" w:eastAsia="Times New Roman" w:hAnsi="Times New Roman" w:cs="Times New Roman"/>
+          <w:sz w:val="24"/>
+          <w:szCs w:val="24"/>
         </w:rPr>
         <w:t>dim_customer</w:t>
       </w:r>
       <w:proofErr w:type="spellEnd"/>
       <w:r>
         <w:rPr>
-          <w:rFonts w:ascii="Courier New" w:eastAsia="Times New Roman" w:hAnsi="Courier New" w:cs="Courier New"/>
-          <w:sz w:val="20"/>
-          <w:szCs w:val="20"/>
+          <w:rFonts w:ascii="Times New Roman" w:eastAsia="Times New Roman" w:hAnsi="Times New Roman" w:cs="Times New Roman"/>
+          <w:sz w:val="24"/>
+          <w:szCs w:val="24"/>
         </w:rPr>
         <w:br/>
       </w:r>
       <w:proofErr w:type="spellStart"/>
       <w:r>
         <w:rPr>
-          <w:rFonts w:ascii="Courier New" w:eastAsia="Times New Roman" w:hAnsi="Courier New" w:cs="Courier New"/>
-          <w:sz w:val="20"/>
-          <w:szCs w:val="20"/>
+          <w:rFonts w:ascii="Times New Roman" w:eastAsia="Times New Roman" w:hAnsi="Times New Roman" w:cs="Times New Roman"/>
+          <w:sz w:val="24"/>
+          <w:szCs w:val="24"/>
         </w:rPr>
         <w:t>dim_date</w:t>
       </w:r>
       <w:proofErr w:type="spellEnd"/>
       <w:r>
         <w:rPr>
-          <w:rFonts w:ascii="Courier New" w:eastAsia="Times New Roman" w:hAnsi="Courier New" w:cs="Courier New"/>
-          <w:sz w:val="20"/>
-          <w:szCs w:val="20"/>
+          <w:rFonts w:ascii="Times New Roman" w:eastAsia="Times New Roman" w:hAnsi="Times New Roman" w:cs="Times New Roman"/>
+          <w:sz w:val="24"/>
+          <w:szCs w:val="24"/>
         </w:rPr>
         <w:br/>
       </w:r>
       <w:proofErr w:type="spellStart"/>
       <w:r>
         <w:rPr>
-          <w:rFonts w:ascii="Courier New" w:eastAsia="Times New Roman" w:hAnsi="Courier New" w:cs="Courier New"/>
-          <w:sz w:val="20"/>
-          <w:szCs w:val="20"/>
+          <w:rFonts w:ascii="Times New Roman" w:eastAsia="Times New Roman" w:hAnsi="Times New Roman" w:cs="Times New Roman"/>
+          <w:sz w:val="24"/>
+          <w:szCs w:val="24"/>
         </w:rPr>
         <w:t>dim_region</w:t>
       </w:r>
       <w:proofErr w:type="spellEnd"/>
       <w:r>
         <w:rPr>
-          <w:rFonts w:ascii="Courier New" w:eastAsia="Times New Roman" w:hAnsi="Courier New" w:cs="Courier New"/>
-          <w:sz w:val="20"/>
-          <w:szCs w:val="20"/>
+          <w:rFonts w:ascii="Times New Roman" w:eastAsia="Times New Roman" w:hAnsi="Times New Roman" w:cs="Times New Roman"/>
+          <w:sz w:val="24"/>
+          <w:szCs w:val="24"/>
         </w:rPr>
         <w:br/>
       </w:r>
       <w:proofErr w:type="spellStart"/>
       <w:r>
         <w:rPr>
-          <w:rFonts w:ascii="Courier New" w:eastAsia="Times New Roman" w:hAnsi="Courier New" w:cs="Courier New"/>
-          <w:sz w:val="20"/>
-          <w:szCs w:val="20"/>
+          <w:rFonts w:ascii="Times New Roman" w:eastAsia="Times New Roman" w:hAnsi="Times New Roman" w:cs="Times New Roman"/>
+          <w:sz w:val="24"/>
+          <w:szCs w:val="24"/>
         </w:rPr>
         <w:t>dim_product</w:t>
       </w:r>
@@ -2550,7 +2568,6 @@
           <w:sz w:val="24"/>
           <w:szCs w:val="24"/>
         </w:rPr>
-        <w:lastRenderedPageBreak/>
         <w:t>This gives true enterprise warehouse architecture.</w:t>
       </w:r>
     </w:p>
@@ -2583,8 +2600,8 @@
           <w:b/>
           <w:bCs/>
           <w:kern w:val="36"/>
-          <w:sz w:val="48"/>
-          <w:szCs w:val="48"/>
+          <w:sz w:val="24"/>
+          <w:szCs w:val="24"/>
         </w:rPr>
       </w:pPr>
       <w:r>
@@ -2593,8 +2610,8 @@
           <w:b/>
           <w:bCs/>
           <w:kern w:val="36"/>
-          <w:sz w:val="48"/>
-          <w:szCs w:val="48"/>
+          <w:sz w:val="24"/>
+          <w:szCs w:val="24"/>
         </w:rPr>
         <w:t xml:space="preserve">Phase 4 — </w:t>
       </w:r>
@@ -2605,8 +2622,8 @@
           <w:b/>
           <w:bCs/>
           <w:kern w:val="36"/>
-          <w:sz w:val="48"/>
-          <w:szCs w:val="48"/>
+          <w:sz w:val="24"/>
+          <w:szCs w:val="24"/>
         </w:rPr>
         <w:t>dbt</w:t>
       </w:r>
@@ -2673,13 +2690,28 @@
     <w:p>
       <w:pPr>
         <w:spacing w:before="100" w:beforeAutospacing="1" w:after="100" w:afterAutospacing="1" w:line="240" w:lineRule="auto"/>
+        <w:rPr>
+          <w:rFonts w:ascii="Times New Roman" w:hAnsi="Times New Roman" w:cs="Times New Roman"/>
+          <w:sz w:val="24"/>
+          <w:szCs w:val="24"/>
+        </w:rPr>
       </w:pPr>
       <w:proofErr w:type="spellStart"/>
       <w:r>
+        <w:rPr>
+          <w:rFonts w:ascii="Times New Roman" w:hAnsi="Times New Roman" w:cs="Times New Roman"/>
+          <w:sz w:val="24"/>
+          <w:szCs w:val="24"/>
+        </w:rPr>
         <w:t>dbt</w:t>
       </w:r>
       <w:proofErr w:type="spellEnd"/>
       <w:r>
+        <w:rPr>
+          <w:rFonts w:ascii="Times New Roman" w:hAnsi="Times New Roman" w:cs="Times New Roman"/>
+          <w:sz w:val="24"/>
+          <w:szCs w:val="24"/>
+        </w:rPr>
         <w:t xml:space="preserve"> is the software engineering layer for analytics and data warehousing.</w:t>
       </w:r>
     </w:p>
@@ -2695,74 +2727,146 @@
       <w:r>
         <w:rPr>
           <w:rFonts w:ascii="Segoe UI Symbol" w:hAnsi="Segoe UI Symbol" w:cs="Segoe UI Symbol"/>
+          <w:sz w:val="24"/>
+          <w:szCs w:val="24"/>
         </w:rPr>
         <w:t>✅</w:t>
       </w:r>
       <w:r>
+        <w:rPr>
+          <w:rFonts w:ascii="Times New Roman" w:hAnsi="Times New Roman" w:cs="Times New Roman"/>
+          <w:sz w:val="24"/>
+          <w:szCs w:val="24"/>
+        </w:rPr>
         <w:t xml:space="preserve"> Transform data</w:t>
       </w:r>
       <w:r>
+        <w:rPr>
+          <w:rFonts w:ascii="Times New Roman" w:hAnsi="Times New Roman" w:cs="Times New Roman"/>
+          <w:sz w:val="24"/>
+          <w:szCs w:val="24"/>
+        </w:rPr>
         <w:br/>
       </w:r>
       <w:r>
         <w:rPr>
           <w:rFonts w:ascii="Segoe UI Symbol" w:hAnsi="Segoe UI Symbol" w:cs="Segoe UI Symbol"/>
+          <w:sz w:val="24"/>
+          <w:szCs w:val="24"/>
         </w:rPr>
         <w:t>✅</w:t>
       </w:r>
       <w:r>
+        <w:rPr>
+          <w:rFonts w:ascii="Times New Roman" w:hAnsi="Times New Roman" w:cs="Times New Roman"/>
+          <w:sz w:val="24"/>
+          <w:szCs w:val="24"/>
+        </w:rPr>
         <w:t xml:space="preserve"> Create reusable business logic</w:t>
       </w:r>
       <w:r>
+        <w:rPr>
+          <w:rFonts w:ascii="Times New Roman" w:hAnsi="Times New Roman" w:cs="Times New Roman"/>
+          <w:sz w:val="24"/>
+          <w:szCs w:val="24"/>
+        </w:rPr>
         <w:br/>
       </w:r>
       <w:r>
         <w:rPr>
           <w:rFonts w:ascii="Segoe UI Symbol" w:hAnsi="Segoe UI Symbol" w:cs="Segoe UI Symbol"/>
+          <w:sz w:val="24"/>
+          <w:szCs w:val="24"/>
         </w:rPr>
         <w:t>✅</w:t>
       </w:r>
       <w:r>
+        <w:rPr>
+          <w:rFonts w:ascii="Times New Roman" w:hAnsi="Times New Roman" w:cs="Times New Roman"/>
+          <w:sz w:val="24"/>
+          <w:szCs w:val="24"/>
+        </w:rPr>
         <w:t xml:space="preserve"> Test data quality</w:t>
       </w:r>
       <w:r>
+        <w:rPr>
+          <w:rFonts w:ascii="Times New Roman" w:hAnsi="Times New Roman" w:cs="Times New Roman"/>
+          <w:sz w:val="24"/>
+          <w:szCs w:val="24"/>
+        </w:rPr>
         <w:br/>
       </w:r>
       <w:r>
         <w:rPr>
           <w:rFonts w:ascii="Segoe UI Symbol" w:hAnsi="Segoe UI Symbol" w:cs="Segoe UI Symbol"/>
+          <w:sz w:val="24"/>
+          <w:szCs w:val="24"/>
         </w:rPr>
         <w:t>✅</w:t>
       </w:r>
       <w:r>
+        <w:rPr>
+          <w:rFonts w:ascii="Times New Roman" w:hAnsi="Times New Roman" w:cs="Times New Roman"/>
+          <w:sz w:val="24"/>
+          <w:szCs w:val="24"/>
+        </w:rPr>
         <w:t xml:space="preserve"> Document data models</w:t>
       </w:r>
       <w:r>
+        <w:rPr>
+          <w:rFonts w:ascii="Times New Roman" w:hAnsi="Times New Roman" w:cs="Times New Roman"/>
+          <w:sz w:val="24"/>
+          <w:szCs w:val="24"/>
+        </w:rPr>
         <w:br/>
       </w:r>
       <w:r>
         <w:rPr>
           <w:rFonts w:ascii="Segoe UI Symbol" w:hAnsi="Segoe UI Symbol" w:cs="Segoe UI Symbol"/>
+          <w:sz w:val="24"/>
+          <w:szCs w:val="24"/>
         </w:rPr>
         <w:t>✅</w:t>
       </w:r>
       <w:r>
+        <w:rPr>
+          <w:rFonts w:ascii="Times New Roman" w:hAnsi="Times New Roman" w:cs="Times New Roman"/>
+          <w:sz w:val="24"/>
+          <w:szCs w:val="24"/>
+        </w:rPr>
         <w:t xml:space="preserve"> Track data lineage</w:t>
       </w:r>
       <w:r>
+        <w:rPr>
+          <w:rFonts w:ascii="Times New Roman" w:hAnsi="Times New Roman" w:cs="Times New Roman"/>
+          <w:sz w:val="24"/>
+          <w:szCs w:val="24"/>
+        </w:rPr>
         <w:br/>
       </w:r>
       <w:r>
         <w:rPr>
           <w:rFonts w:ascii="Segoe UI Symbol" w:hAnsi="Segoe UI Symbol" w:cs="Segoe UI Symbol"/>
+          <w:sz w:val="24"/>
+          <w:szCs w:val="24"/>
         </w:rPr>
         <w:t>✅</w:t>
       </w:r>
       <w:r>
+        <w:rPr>
+          <w:rFonts w:ascii="Times New Roman" w:hAnsi="Times New Roman" w:cs="Times New Roman"/>
+          <w:sz w:val="24"/>
+          <w:szCs w:val="24"/>
+        </w:rPr>
         <w:t xml:space="preserve"> Version control transformations with </w:t>
       </w:r>
       <w:proofErr w:type="spellStart"/>
       <w:r>
+        <w:rPr>
+          <w:rFonts w:ascii="Times New Roman" w:hAnsi="Times New Roman" w:cs="Times New Roman"/>
+          <w:sz w:val="24"/>
+          <w:szCs w:val="24"/>
+        </w:rPr>
         <w:t>Git</w:t>
       </w:r>
       <w:proofErr w:type="spellEnd"/>
@@ -2775,8 +2879,6 @@
         <w:rPr>
           <w:b/>
           <w:bCs/>
-          <w:sz w:val="27"/>
-          <w:szCs w:val="27"/>
         </w:rPr>
         <w:t>Staging</w:t>
       </w:r>
@@ -2784,16 +2886,11 @@
         <w:rPr>
           <w:b/>
           <w:bCs/>
-          <w:sz w:val="27"/>
-          <w:szCs w:val="27"/>
         </w:rPr>
         <w:t xml:space="preserve"> - </w:t>
       </w:r>
       <w:r>
-        <w:t xml:space="preserve">Clean and standardize raw warehouse tables. </w:t>
-      </w:r>
-      <w:r>
-        <w:t>Make data consistent.</w:t>
+        <w:t>Clean and standardize raw warehouse tables. Make data consistent.</w:t>
       </w:r>
     </w:p>
     <w:p>
@@ -2818,53 +2915,53 @@
         </w:tabs>
         <w:spacing w:after="0" w:line="240" w:lineRule="auto"/>
         <w:rPr>
-          <w:rFonts w:ascii="Courier New" w:eastAsia="Times New Roman" w:hAnsi="Courier New" w:cs="Courier New"/>
-          <w:sz w:val="20"/>
-          <w:szCs w:val="20"/>
+          <w:rFonts w:ascii="Times New Roman" w:eastAsia="Times New Roman" w:hAnsi="Times New Roman" w:cs="Times New Roman"/>
+          <w:sz w:val="24"/>
+          <w:szCs w:val="24"/>
         </w:rPr>
       </w:pPr>
       <w:proofErr w:type="spellStart"/>
       <w:r>
         <w:rPr>
-          <w:rFonts w:ascii="Courier New" w:eastAsia="Times New Roman" w:hAnsi="Courier New" w:cs="Courier New"/>
-          <w:sz w:val="20"/>
-          <w:szCs w:val="20"/>
+          <w:rFonts w:ascii="Times New Roman" w:eastAsia="Times New Roman" w:hAnsi="Times New Roman" w:cs="Times New Roman"/>
+          <w:sz w:val="24"/>
+          <w:szCs w:val="24"/>
         </w:rPr>
         <w:t>stg_customers</w:t>
       </w:r>
       <w:proofErr w:type="spellEnd"/>
       <w:r>
         <w:rPr>
-          <w:rFonts w:ascii="Courier New" w:eastAsia="Times New Roman" w:hAnsi="Courier New" w:cs="Courier New"/>
-          <w:sz w:val="20"/>
-          <w:szCs w:val="20"/>
+          <w:rFonts w:ascii="Times New Roman" w:eastAsia="Times New Roman" w:hAnsi="Times New Roman" w:cs="Times New Roman"/>
+          <w:sz w:val="24"/>
+          <w:szCs w:val="24"/>
         </w:rPr>
         <w:br/>
       </w:r>
       <w:proofErr w:type="spellStart"/>
       <w:r>
         <w:rPr>
-          <w:rFonts w:ascii="Courier New" w:eastAsia="Times New Roman" w:hAnsi="Courier New" w:cs="Courier New"/>
-          <w:sz w:val="20"/>
-          <w:szCs w:val="20"/>
+          <w:rFonts w:ascii="Times New Roman" w:eastAsia="Times New Roman" w:hAnsi="Times New Roman" w:cs="Times New Roman"/>
+          <w:sz w:val="24"/>
+          <w:szCs w:val="24"/>
         </w:rPr>
         <w:t>stg_sales</w:t>
       </w:r>
       <w:proofErr w:type="spellEnd"/>
       <w:r>
         <w:rPr>
-          <w:rFonts w:ascii="Courier New" w:eastAsia="Times New Roman" w:hAnsi="Courier New" w:cs="Courier New"/>
-          <w:sz w:val="20"/>
-          <w:szCs w:val="20"/>
+          <w:rFonts w:ascii="Times New Roman" w:eastAsia="Times New Roman" w:hAnsi="Times New Roman" w:cs="Times New Roman"/>
+          <w:sz w:val="24"/>
+          <w:szCs w:val="24"/>
         </w:rPr>
         <w:br/>
       </w:r>
       <w:proofErr w:type="spellStart"/>
       <w:r>
         <w:rPr>
-          <w:rFonts w:ascii="Courier New" w:eastAsia="Times New Roman" w:hAnsi="Courier New" w:cs="Courier New"/>
-          <w:sz w:val="20"/>
-          <w:szCs w:val="20"/>
+          <w:rFonts w:ascii="Times New Roman" w:eastAsia="Times New Roman" w:hAnsi="Times New Roman" w:cs="Times New Roman"/>
+          <w:sz w:val="24"/>
+          <w:szCs w:val="24"/>
         </w:rPr>
         <w:t>stg_marketing</w:t>
       </w:r>
@@ -2878,17 +2975,17 @@
           <w:rFonts w:ascii="Times New Roman" w:eastAsia="Times New Roman" w:hAnsi="Times New Roman" w:cs="Times New Roman"/>
           <w:b/>
           <w:bCs/>
-          <w:sz w:val="27"/>
-          <w:szCs w:val="27"/>
-        </w:rPr>
-      </w:pPr>
-      <w:r>
-        <w:rPr>
-          <w:rFonts w:ascii="Times New Roman" w:eastAsia="Times New Roman" w:hAnsi="Times New Roman" w:cs="Times New Roman"/>
-          <w:b/>
-          <w:bCs/>
-          <w:sz w:val="27"/>
-          <w:szCs w:val="27"/>
+          <w:sz w:val="24"/>
+          <w:szCs w:val="24"/>
+        </w:rPr>
+      </w:pPr>
+      <w:r>
+        <w:rPr>
+          <w:rFonts w:ascii="Times New Roman" w:eastAsia="Times New Roman" w:hAnsi="Times New Roman" w:cs="Times New Roman"/>
+          <w:b/>
+          <w:bCs/>
+          <w:sz w:val="24"/>
+          <w:szCs w:val="24"/>
         </w:rPr>
         <w:t>Intermediate</w:t>
       </w:r>
@@ -2897,19 +2994,18 @@
           <w:rFonts w:ascii="Times New Roman" w:eastAsia="Times New Roman" w:hAnsi="Times New Roman" w:cs="Times New Roman"/>
           <w:b/>
           <w:bCs/>
-          <w:sz w:val="27"/>
-          <w:szCs w:val="27"/>
+          <w:sz w:val="24"/>
+          <w:szCs w:val="24"/>
         </w:rPr>
         <w:t xml:space="preserve"> - </w:t>
       </w:r>
       <w:r>
-        <w:t>Business calculations and joins.</w:t>
-      </w:r>
-      <w:r>
-        <w:t xml:space="preserve"> </w:t>
-      </w:r>
-      <w:r>
-        <w:t>Build reusable business logic.</w:t>
+        <w:rPr>
+          <w:rFonts w:ascii="Times New Roman" w:hAnsi="Times New Roman" w:cs="Times New Roman"/>
+          <w:sz w:val="24"/>
+          <w:szCs w:val="24"/>
+        </w:rPr>
+        <w:t>Business calculations and joins. Build reusable business logic.</w:t>
       </w:r>
     </w:p>
     <w:p>
@@ -2934,35 +3030,35 @@
         </w:tabs>
         <w:spacing w:after="0" w:line="240" w:lineRule="auto"/>
         <w:rPr>
-          <w:rFonts w:ascii="Courier New" w:eastAsia="Times New Roman" w:hAnsi="Courier New" w:cs="Courier New"/>
-          <w:sz w:val="20"/>
-          <w:szCs w:val="20"/>
+          <w:rFonts w:ascii="Times New Roman" w:eastAsia="Times New Roman" w:hAnsi="Times New Roman" w:cs="Times New Roman"/>
+          <w:sz w:val="24"/>
+          <w:szCs w:val="24"/>
         </w:rPr>
       </w:pPr>
       <w:proofErr w:type="spellStart"/>
       <w:r>
         <w:rPr>
-          <w:rFonts w:ascii="Courier New" w:eastAsia="Times New Roman" w:hAnsi="Courier New" w:cs="Courier New"/>
-          <w:sz w:val="20"/>
-          <w:szCs w:val="20"/>
+          <w:rFonts w:ascii="Times New Roman" w:eastAsia="Times New Roman" w:hAnsi="Times New Roman" w:cs="Times New Roman"/>
+          <w:sz w:val="24"/>
+          <w:szCs w:val="24"/>
         </w:rPr>
         <w:t>int_customer_health</w:t>
       </w:r>
       <w:proofErr w:type="spellEnd"/>
       <w:r>
         <w:rPr>
-          <w:rFonts w:ascii="Courier New" w:eastAsia="Times New Roman" w:hAnsi="Courier New" w:cs="Courier New"/>
-          <w:sz w:val="20"/>
-          <w:szCs w:val="20"/>
+          <w:rFonts w:ascii="Times New Roman" w:eastAsia="Times New Roman" w:hAnsi="Times New Roman" w:cs="Times New Roman"/>
+          <w:sz w:val="24"/>
+          <w:szCs w:val="24"/>
         </w:rPr>
         <w:br/>
       </w:r>
       <w:proofErr w:type="spellStart"/>
       <w:r>
         <w:rPr>
-          <w:rFonts w:ascii="Courier New" w:eastAsia="Times New Roman" w:hAnsi="Courier New" w:cs="Courier New"/>
-          <w:sz w:val="20"/>
-          <w:szCs w:val="20"/>
+          <w:rFonts w:ascii="Times New Roman" w:eastAsia="Times New Roman" w:hAnsi="Times New Roman" w:cs="Times New Roman"/>
+          <w:sz w:val="24"/>
+          <w:szCs w:val="24"/>
         </w:rPr>
         <w:t>int_revenue_growth</w:t>
       </w:r>
@@ -2976,17 +3072,17 @@
           <w:rFonts w:ascii="Times New Roman" w:eastAsia="Times New Roman" w:hAnsi="Times New Roman" w:cs="Times New Roman"/>
           <w:b/>
           <w:bCs/>
-          <w:sz w:val="27"/>
-          <w:szCs w:val="27"/>
-        </w:rPr>
-      </w:pPr>
-      <w:r>
-        <w:rPr>
-          <w:rFonts w:ascii="Times New Roman" w:eastAsia="Times New Roman" w:hAnsi="Times New Roman" w:cs="Times New Roman"/>
-          <w:b/>
-          <w:bCs/>
-          <w:sz w:val="27"/>
-          <w:szCs w:val="27"/>
+          <w:sz w:val="24"/>
+          <w:szCs w:val="24"/>
+        </w:rPr>
+      </w:pPr>
+      <w:r>
+        <w:rPr>
+          <w:rFonts w:ascii="Times New Roman" w:eastAsia="Times New Roman" w:hAnsi="Times New Roman" w:cs="Times New Roman"/>
+          <w:b/>
+          <w:bCs/>
+          <w:sz w:val="24"/>
+          <w:szCs w:val="24"/>
         </w:rPr>
         <w:t>Marts</w:t>
       </w:r>
@@ -2995,19 +3091,18 @@
           <w:rFonts w:ascii="Times New Roman" w:eastAsia="Times New Roman" w:hAnsi="Times New Roman" w:cs="Times New Roman"/>
           <w:b/>
           <w:bCs/>
-          <w:sz w:val="27"/>
-          <w:szCs w:val="27"/>
+          <w:sz w:val="24"/>
+          <w:szCs w:val="24"/>
         </w:rPr>
         <w:t xml:space="preserve"> - </w:t>
       </w:r>
       <w:r>
-        <w:t>Final executive-ready tables.</w:t>
-      </w:r>
-      <w:r>
-        <w:t xml:space="preserve"> </w:t>
-      </w:r>
-      <w:r>
-        <w:t>Feed dashboards and reports.</w:t>
+        <w:rPr>
+          <w:rFonts w:ascii="Times New Roman" w:hAnsi="Times New Roman" w:cs="Times New Roman"/>
+          <w:sz w:val="24"/>
+          <w:szCs w:val="24"/>
+        </w:rPr>
+        <w:t>Final executive-ready tables. Feed dashboards and reports.</w:t>
       </w:r>
     </w:p>
     <w:p>
@@ -3032,53 +3127,53 @@
         </w:tabs>
         <w:spacing w:after="0" w:line="240" w:lineRule="auto"/>
         <w:rPr>
-          <w:rFonts w:ascii="Courier New" w:eastAsia="Times New Roman" w:hAnsi="Courier New" w:cs="Courier New"/>
-          <w:sz w:val="20"/>
-          <w:szCs w:val="20"/>
+          <w:rFonts w:ascii="Times New Roman" w:eastAsia="Times New Roman" w:hAnsi="Times New Roman" w:cs="Times New Roman"/>
+          <w:sz w:val="24"/>
+          <w:szCs w:val="24"/>
         </w:rPr>
       </w:pPr>
       <w:proofErr w:type="spellStart"/>
       <w:r>
         <w:rPr>
-          <w:rFonts w:ascii="Courier New" w:eastAsia="Times New Roman" w:hAnsi="Courier New" w:cs="Courier New"/>
-          <w:sz w:val="20"/>
-          <w:szCs w:val="20"/>
+          <w:rFonts w:ascii="Times New Roman" w:eastAsia="Times New Roman" w:hAnsi="Times New Roman" w:cs="Times New Roman"/>
+          <w:sz w:val="24"/>
+          <w:szCs w:val="24"/>
         </w:rPr>
         <w:t>mart_executive_summary</w:t>
       </w:r>
       <w:proofErr w:type="spellEnd"/>
       <w:r>
         <w:rPr>
-          <w:rFonts w:ascii="Courier New" w:eastAsia="Times New Roman" w:hAnsi="Courier New" w:cs="Courier New"/>
-          <w:sz w:val="20"/>
-          <w:szCs w:val="20"/>
+          <w:rFonts w:ascii="Times New Roman" w:eastAsia="Times New Roman" w:hAnsi="Times New Roman" w:cs="Times New Roman"/>
+          <w:sz w:val="24"/>
+          <w:szCs w:val="24"/>
         </w:rPr>
         <w:br/>
       </w:r>
       <w:proofErr w:type="spellStart"/>
       <w:r>
         <w:rPr>
-          <w:rFonts w:ascii="Courier New" w:eastAsia="Times New Roman" w:hAnsi="Courier New" w:cs="Courier New"/>
-          <w:sz w:val="20"/>
-          <w:szCs w:val="20"/>
+          <w:rFonts w:ascii="Times New Roman" w:eastAsia="Times New Roman" w:hAnsi="Times New Roman" w:cs="Times New Roman"/>
+          <w:sz w:val="24"/>
+          <w:szCs w:val="24"/>
         </w:rPr>
         <w:t>mart_revenue_forecast</w:t>
       </w:r>
       <w:proofErr w:type="spellEnd"/>
       <w:r>
         <w:rPr>
-          <w:rFonts w:ascii="Courier New" w:eastAsia="Times New Roman" w:hAnsi="Courier New" w:cs="Courier New"/>
-          <w:sz w:val="20"/>
-          <w:szCs w:val="20"/>
+          <w:rFonts w:ascii="Times New Roman" w:eastAsia="Times New Roman" w:hAnsi="Times New Roman" w:cs="Times New Roman"/>
+          <w:sz w:val="24"/>
+          <w:szCs w:val="24"/>
         </w:rPr>
         <w:br/>
       </w:r>
       <w:proofErr w:type="spellStart"/>
       <w:r>
         <w:rPr>
-          <w:rFonts w:ascii="Courier New" w:eastAsia="Times New Roman" w:hAnsi="Courier New" w:cs="Courier New"/>
-          <w:sz w:val="20"/>
-          <w:szCs w:val="20"/>
+          <w:rFonts w:ascii="Times New Roman" w:eastAsia="Times New Roman" w:hAnsi="Times New Roman" w:cs="Times New Roman"/>
+          <w:sz w:val="24"/>
+          <w:szCs w:val="24"/>
         </w:rPr>
         <w:t>mart_customer_risk</w:t>
       </w:r>
@@ -3106,27 +3201,19 @@
         </w:tabs>
         <w:spacing w:after="0" w:line="240" w:lineRule="auto"/>
         <w:rPr>
-          <w:rFonts w:ascii="Courier New" w:eastAsia="Times New Roman" w:hAnsi="Courier New" w:cs="Courier New"/>
-          <w:sz w:val="20"/>
-          <w:szCs w:val="20"/>
+          <w:rFonts w:ascii="Times New Roman" w:eastAsia="Times New Roman" w:hAnsi="Times New Roman" w:cs="Times New Roman"/>
+          <w:sz w:val="24"/>
+          <w:szCs w:val="24"/>
         </w:rPr>
       </w:pPr>
       <w:proofErr w:type="spellStart"/>
       <w:r>
         <w:rPr>
-          <w:rFonts w:ascii="Courier New" w:eastAsia="Times New Roman" w:hAnsi="Courier New" w:cs="Courier New"/>
-          <w:sz w:val="20"/>
-          <w:szCs w:val="20"/>
-        </w:rPr>
-        <w:t>mart_</w:t>
-      </w:r>
-      <w:r>
-        <w:rPr>
-          <w:rFonts w:ascii="Courier New" w:eastAsia="Times New Roman" w:hAnsi="Courier New" w:cs="Courier New"/>
-          <w:sz w:val="20"/>
-          <w:szCs w:val="20"/>
-        </w:rPr>
-        <w:t>sales_performance</w:t>
+          <w:rFonts w:ascii="Times New Roman" w:eastAsia="Times New Roman" w:hAnsi="Times New Roman" w:cs="Times New Roman"/>
+          <w:sz w:val="24"/>
+          <w:szCs w:val="24"/>
+        </w:rPr>
+        <w:t>mart_sales_performance</w:t>
       </w:r>
       <w:proofErr w:type="spellEnd"/>
     </w:p>
@@ -3175,6 +3262,7 @@
           <w:sz w:val="24"/>
           <w:szCs w:val="24"/>
         </w:rPr>
+        <w:lastRenderedPageBreak/>
         <w:t xml:space="preserve">Tests </w:t>
       </w:r>
     </w:p>
@@ -3269,8 +3357,8 @@
           <w:b/>
           <w:bCs/>
           <w:kern w:val="36"/>
-          <w:sz w:val="48"/>
-          <w:szCs w:val="48"/>
+          <w:sz w:val="24"/>
+          <w:szCs w:val="24"/>
         </w:rPr>
       </w:pPr>
       <w:r>
@@ -3279,10 +3367,9 @@
           <w:b/>
           <w:bCs/>
           <w:kern w:val="36"/>
-          <w:sz w:val="48"/>
-          <w:szCs w:val="48"/>
-        </w:rPr>
-        <w:lastRenderedPageBreak/>
+          <w:sz w:val="24"/>
+          <w:szCs w:val="24"/>
+        </w:rPr>
         <w:t>Phase 5 — Machine Learning</w:t>
       </w:r>
     </w:p>
@@ -3294,17 +3381,17 @@
           <w:rFonts w:ascii="Times New Roman" w:eastAsia="Times New Roman" w:hAnsi="Times New Roman" w:cs="Times New Roman"/>
           <w:b/>
           <w:bCs/>
-          <w:sz w:val="27"/>
-          <w:szCs w:val="27"/>
-        </w:rPr>
-      </w:pPr>
-      <w:r>
-        <w:rPr>
-          <w:rFonts w:ascii="Times New Roman" w:eastAsia="Times New Roman" w:hAnsi="Times New Roman" w:cs="Times New Roman"/>
-          <w:b/>
-          <w:bCs/>
-          <w:sz w:val="27"/>
-          <w:szCs w:val="27"/>
+          <w:sz w:val="24"/>
+          <w:szCs w:val="24"/>
+        </w:rPr>
+      </w:pPr>
+      <w:r>
+        <w:rPr>
+          <w:rFonts w:ascii="Times New Roman" w:eastAsia="Times New Roman" w:hAnsi="Times New Roman" w:cs="Times New Roman"/>
+          <w:b/>
+          <w:bCs/>
+          <w:sz w:val="24"/>
+          <w:szCs w:val="24"/>
         </w:rPr>
         <w:t>Revenue Forecasting</w:t>
       </w:r>
@@ -3349,24 +3436,24 @@
         </w:tabs>
         <w:spacing w:after="0" w:line="240" w:lineRule="auto"/>
         <w:rPr>
-          <w:rFonts w:ascii="Courier New" w:eastAsia="Times New Roman" w:hAnsi="Courier New" w:cs="Courier New"/>
-          <w:sz w:val="20"/>
-          <w:szCs w:val="20"/>
-        </w:rPr>
-      </w:pPr>
-      <w:r>
-        <w:rPr>
-          <w:rFonts w:ascii="Courier New" w:eastAsia="Times New Roman" w:hAnsi="Courier New" w:cs="Courier New"/>
-          <w:sz w:val="20"/>
-          <w:szCs w:val="20"/>
+          <w:rFonts w:ascii="Times New Roman" w:eastAsia="Times New Roman" w:hAnsi="Times New Roman" w:cs="Times New Roman"/>
+          <w:sz w:val="24"/>
+          <w:szCs w:val="24"/>
+        </w:rPr>
+      </w:pPr>
+      <w:r>
+        <w:rPr>
+          <w:rFonts w:ascii="Times New Roman" w:eastAsia="Times New Roman" w:hAnsi="Times New Roman" w:cs="Times New Roman"/>
+          <w:sz w:val="24"/>
+          <w:szCs w:val="24"/>
         </w:rPr>
         <w:t>next month revenue</w:t>
       </w:r>
       <w:r>
         <w:rPr>
-          <w:rFonts w:ascii="Courier New" w:eastAsia="Times New Roman" w:hAnsi="Courier New" w:cs="Courier New"/>
-          <w:sz w:val="20"/>
-          <w:szCs w:val="20"/>
+          <w:rFonts w:ascii="Times New Roman" w:eastAsia="Times New Roman" w:hAnsi="Times New Roman" w:cs="Times New Roman"/>
+          <w:sz w:val="24"/>
+          <w:szCs w:val="24"/>
         </w:rPr>
         <w:br/>
         <w:t>next quarter revenue</w:t>
@@ -3452,17 +3539,17 @@
           <w:rFonts w:ascii="Times New Roman" w:eastAsia="Times New Roman" w:hAnsi="Times New Roman" w:cs="Times New Roman"/>
           <w:b/>
           <w:bCs/>
-          <w:sz w:val="27"/>
-          <w:szCs w:val="27"/>
-        </w:rPr>
-      </w:pPr>
-      <w:r>
-        <w:rPr>
-          <w:rFonts w:ascii="Times New Roman" w:eastAsia="Times New Roman" w:hAnsi="Times New Roman" w:cs="Times New Roman"/>
-          <w:b/>
-          <w:bCs/>
-          <w:sz w:val="27"/>
-          <w:szCs w:val="27"/>
+          <w:sz w:val="24"/>
+          <w:szCs w:val="24"/>
+        </w:rPr>
+      </w:pPr>
+      <w:r>
+        <w:rPr>
+          <w:rFonts w:ascii="Times New Roman" w:eastAsia="Times New Roman" w:hAnsi="Times New Roman" w:cs="Times New Roman"/>
+          <w:b/>
+          <w:bCs/>
+          <w:sz w:val="24"/>
+          <w:szCs w:val="24"/>
         </w:rPr>
         <w:t>Churn Prediction</w:t>
       </w:r>
@@ -3507,33 +3594,33 @@
         </w:tabs>
         <w:spacing w:after="0" w:line="240" w:lineRule="auto"/>
         <w:rPr>
-          <w:rFonts w:ascii="Courier New" w:eastAsia="Times New Roman" w:hAnsi="Courier New" w:cs="Courier New"/>
-          <w:sz w:val="20"/>
-          <w:szCs w:val="20"/>
-        </w:rPr>
-      </w:pPr>
-      <w:r>
-        <w:rPr>
-          <w:rFonts w:ascii="Courier New" w:eastAsia="Times New Roman" w:hAnsi="Courier New" w:cs="Courier New"/>
-          <w:sz w:val="20"/>
-          <w:szCs w:val="20"/>
+          <w:rFonts w:ascii="Times New Roman" w:eastAsia="Times New Roman" w:hAnsi="Times New Roman" w:cs="Times New Roman"/>
+          <w:sz w:val="24"/>
+          <w:szCs w:val="24"/>
+        </w:rPr>
+      </w:pPr>
+      <w:r>
+        <w:rPr>
+          <w:rFonts w:ascii="Times New Roman" w:eastAsia="Times New Roman" w:hAnsi="Times New Roman" w:cs="Times New Roman"/>
+          <w:sz w:val="24"/>
+          <w:szCs w:val="24"/>
         </w:rPr>
         <w:t>High</w:t>
       </w:r>
       <w:r>
         <w:rPr>
-          <w:rFonts w:ascii="Courier New" w:eastAsia="Times New Roman" w:hAnsi="Courier New" w:cs="Courier New"/>
-          <w:sz w:val="20"/>
-          <w:szCs w:val="20"/>
+          <w:rFonts w:ascii="Times New Roman" w:eastAsia="Times New Roman" w:hAnsi="Times New Roman" w:cs="Times New Roman"/>
+          <w:sz w:val="24"/>
+          <w:szCs w:val="24"/>
         </w:rPr>
         <w:br/>
         <w:t>Medium</w:t>
       </w:r>
       <w:r>
         <w:rPr>
-          <w:rFonts w:ascii="Courier New" w:eastAsia="Times New Roman" w:hAnsi="Courier New" w:cs="Courier New"/>
-          <w:sz w:val="20"/>
-          <w:szCs w:val="20"/>
+          <w:rFonts w:ascii="Times New Roman" w:eastAsia="Times New Roman" w:hAnsi="Times New Roman" w:cs="Times New Roman"/>
+          <w:sz w:val="24"/>
+          <w:szCs w:val="24"/>
         </w:rPr>
         <w:br/>
         <w:t>Low</w:t>
@@ -3565,17 +3652,17 @@
           <w:rFonts w:ascii="Times New Roman" w:eastAsia="Times New Roman" w:hAnsi="Times New Roman" w:cs="Times New Roman"/>
           <w:b/>
           <w:bCs/>
-          <w:sz w:val="27"/>
-          <w:szCs w:val="27"/>
-        </w:rPr>
-      </w:pPr>
-      <w:r>
-        <w:rPr>
-          <w:rFonts w:ascii="Times New Roman" w:eastAsia="Times New Roman" w:hAnsi="Times New Roman" w:cs="Times New Roman"/>
-          <w:b/>
-          <w:bCs/>
-          <w:sz w:val="27"/>
-          <w:szCs w:val="27"/>
+          <w:sz w:val="24"/>
+          <w:szCs w:val="24"/>
+        </w:rPr>
+      </w:pPr>
+      <w:r>
+        <w:rPr>
+          <w:rFonts w:ascii="Times New Roman" w:eastAsia="Times New Roman" w:hAnsi="Times New Roman" w:cs="Times New Roman"/>
+          <w:b/>
+          <w:bCs/>
+          <w:sz w:val="24"/>
+          <w:szCs w:val="24"/>
         </w:rPr>
         <w:t>Customer Lifetime Value</w:t>
       </w:r>
@@ -3620,16 +3707,16 @@
         </w:tabs>
         <w:spacing w:after="0" w:line="240" w:lineRule="auto"/>
         <w:rPr>
-          <w:rFonts w:ascii="Courier New" w:eastAsia="Times New Roman" w:hAnsi="Courier New" w:cs="Courier New"/>
-          <w:sz w:val="20"/>
-          <w:szCs w:val="20"/>
-        </w:rPr>
-      </w:pPr>
-      <w:r>
-        <w:rPr>
-          <w:rFonts w:ascii="Courier New" w:eastAsia="Times New Roman" w:hAnsi="Courier New" w:cs="Courier New"/>
-          <w:sz w:val="20"/>
-          <w:szCs w:val="20"/>
+          <w:rFonts w:ascii="Times New Roman" w:eastAsia="Times New Roman" w:hAnsi="Times New Roman" w:cs="Times New Roman"/>
+          <w:sz w:val="24"/>
+          <w:szCs w:val="24"/>
+        </w:rPr>
+      </w:pPr>
+      <w:r>
+        <w:rPr>
+          <w:rFonts w:ascii="Times New Roman" w:eastAsia="Times New Roman" w:hAnsi="Times New Roman" w:cs="Times New Roman"/>
+          <w:sz w:val="24"/>
+          <w:szCs w:val="24"/>
         </w:rPr>
         <w:t>future value</w:t>
       </w:r>
@@ -3663,8 +3750,8 @@
           <w:b/>
           <w:bCs/>
           <w:kern w:val="36"/>
-          <w:sz w:val="48"/>
-          <w:szCs w:val="48"/>
+          <w:sz w:val="24"/>
+          <w:szCs w:val="24"/>
         </w:rPr>
       </w:pPr>
       <w:r>
@@ -3673,15 +3760,15 @@
           <w:b/>
           <w:bCs/>
           <w:kern w:val="36"/>
-          <w:sz w:val="48"/>
-          <w:szCs w:val="48"/>
+          <w:sz w:val="24"/>
+          <w:szCs w:val="24"/>
         </w:rPr>
         <w:t>Phase 6 — Executive KPI Dashboard</w:t>
       </w:r>
     </w:p>
     <w:p>
       <w:pPr>
-        <w:spacing w:before="100" w:beforeAutospacing="1" w:after="100" w:afterAutospacing="1" w:line="240" w:lineRule="auto"/>
+        <w:spacing w:before="100" w:beforeAutospacing="1" w:after="0" w:line="240" w:lineRule="auto"/>
         <w:rPr>
           <w:rFonts w:ascii="Times New Roman" w:eastAsia="Times New Roman" w:hAnsi="Times New Roman" w:cs="Times New Roman"/>
           <w:sz w:val="24"/>
@@ -3699,56 +3786,124 @@
     </w:p>
     <w:p>
       <w:pPr>
-        <w:spacing w:before="100" w:beforeAutospacing="1" w:after="100" w:afterAutospacing="1" w:line="240" w:lineRule="auto"/>
-      </w:pPr>
-      <w:r>
+        <w:spacing w:after="0" w:line="240" w:lineRule="auto"/>
+        <w:rPr>
+          <w:rFonts w:ascii="Times New Roman" w:hAnsi="Times New Roman" w:cs="Times New Roman"/>
+          <w:sz w:val="24"/>
+          <w:szCs w:val="24"/>
+        </w:rPr>
+      </w:pPr>
+      <w:r>
+        <w:rPr>
+          <w:rFonts w:ascii="Times New Roman" w:hAnsi="Times New Roman" w:cs="Times New Roman"/>
+          <w:sz w:val="24"/>
+          <w:szCs w:val="24"/>
+        </w:rPr>
         <w:t>Total Revenue</w:t>
       </w:r>
       <w:r>
+        <w:rPr>
+          <w:rFonts w:ascii="Times New Roman" w:hAnsi="Times New Roman" w:cs="Times New Roman"/>
+          <w:sz w:val="24"/>
+          <w:szCs w:val="24"/>
+        </w:rPr>
         <w:br/>
         <w:t>Active Customers</w:t>
       </w:r>
       <w:r>
+        <w:rPr>
+          <w:rFonts w:ascii="Times New Roman" w:hAnsi="Times New Roman" w:cs="Times New Roman"/>
+          <w:sz w:val="24"/>
+          <w:szCs w:val="24"/>
+        </w:rPr>
         <w:br/>
         <w:t>Revenue At Risk</w:t>
       </w:r>
       <w:r>
+        <w:rPr>
+          <w:rFonts w:ascii="Times New Roman" w:hAnsi="Times New Roman" w:cs="Times New Roman"/>
+          <w:sz w:val="24"/>
+          <w:szCs w:val="24"/>
+        </w:rPr>
         <w:br/>
         <w:t>Average Customer CLV</w:t>
       </w:r>
       <w:r>
+        <w:rPr>
+          <w:rFonts w:ascii="Times New Roman" w:hAnsi="Times New Roman" w:cs="Times New Roman"/>
+          <w:sz w:val="24"/>
+          <w:szCs w:val="24"/>
+        </w:rPr>
         <w:br/>
+      </w:r>
+      <w:r>
+        <w:rPr>
+          <w:rFonts w:ascii="Times New Roman" w:hAnsi="Times New Roman" w:cs="Times New Roman"/>
+          <w:sz w:val="24"/>
+          <w:szCs w:val="24"/>
+        </w:rPr>
+        <w:lastRenderedPageBreak/>
         <w:t>Forecast Revenue</w:t>
       </w:r>
       <w:r>
+        <w:rPr>
+          <w:rFonts w:ascii="Times New Roman" w:hAnsi="Times New Roman" w:cs="Times New Roman"/>
+          <w:sz w:val="24"/>
+          <w:szCs w:val="24"/>
+        </w:rPr>
         <w:br/>
         <w:t>High-Risk Customers</w:t>
       </w:r>
     </w:p>
     <w:p>
       <w:pPr>
-        <w:spacing w:before="100" w:beforeAutospacing="1" w:after="100" w:afterAutospacing="1" w:line="240" w:lineRule="auto"/>
-      </w:pPr>
-      <w:r>
+        <w:spacing w:after="0" w:line="240" w:lineRule="auto"/>
+        <w:rPr>
+          <w:rFonts w:ascii="Times New Roman" w:hAnsi="Times New Roman" w:cs="Times New Roman"/>
+          <w:sz w:val="24"/>
+          <w:szCs w:val="24"/>
+        </w:rPr>
+      </w:pPr>
+      <w:r>
+        <w:rPr>
+          <w:rFonts w:ascii="Times New Roman" w:hAnsi="Times New Roman" w:cs="Times New Roman"/>
+          <w:sz w:val="24"/>
+          <w:szCs w:val="24"/>
+        </w:rPr>
         <w:t>Revenue Trend</w:t>
       </w:r>
     </w:p>
     <w:p>
       <w:pPr>
-        <w:spacing w:before="100" w:beforeAutospacing="1" w:after="100" w:afterAutospacing="1" w:line="240" w:lineRule="auto"/>
-      </w:pPr>
-      <w:r>
+        <w:spacing w:after="0" w:line="240" w:lineRule="auto"/>
+        <w:rPr>
+          <w:rFonts w:ascii="Times New Roman" w:hAnsi="Times New Roman" w:cs="Times New Roman"/>
+          <w:sz w:val="24"/>
+          <w:szCs w:val="24"/>
+        </w:rPr>
+      </w:pPr>
+      <w:r>
+        <w:rPr>
+          <w:rFonts w:ascii="Times New Roman" w:hAnsi="Times New Roman" w:cs="Times New Roman"/>
+          <w:sz w:val="24"/>
+          <w:szCs w:val="24"/>
+        </w:rPr>
         <w:t>Revenue Forecast</w:t>
       </w:r>
     </w:p>
     <w:p>
       <w:pPr>
-        <w:spacing w:before="100" w:beforeAutospacing="1" w:after="100" w:afterAutospacing="1" w:line="240" w:lineRule="auto"/>
-      </w:pPr>
-    </w:p>
-    <w:p>
-      <w:pPr>
-        <w:spacing w:before="100" w:beforeAutospacing="1" w:after="100" w:afterAutospacing="1" w:line="240" w:lineRule="auto"/>
+        <w:spacing w:after="0" w:line="240" w:lineRule="auto"/>
+        <w:rPr>
+          <w:rFonts w:ascii="Times New Roman" w:hAnsi="Times New Roman" w:cs="Times New Roman"/>
+          <w:sz w:val="24"/>
+          <w:szCs w:val="24"/>
+        </w:rPr>
+      </w:pPr>
+    </w:p>
+    <w:p>
+      <w:pPr>
+        <w:spacing w:after="0" w:line="240" w:lineRule="auto"/>
         <w:rPr>
           <w:rFonts w:ascii="Times New Roman" w:eastAsia="Times New Roman" w:hAnsi="Times New Roman" w:cs="Times New Roman"/>
           <w:sz w:val="24"/>
@@ -3766,31 +3921,71 @@
     </w:p>
     <w:p>
       <w:pPr>
-        <w:spacing w:before="100" w:beforeAutospacing="1" w:after="100" w:afterAutospacing="1" w:line="240" w:lineRule="auto"/>
-      </w:pPr>
-      <w:r>
+        <w:spacing w:after="0" w:line="240" w:lineRule="auto"/>
+        <w:rPr>
+          <w:rFonts w:ascii="Times New Roman" w:hAnsi="Times New Roman" w:cs="Times New Roman"/>
+          <w:sz w:val="24"/>
+          <w:szCs w:val="24"/>
+        </w:rPr>
+      </w:pPr>
+      <w:r>
+        <w:rPr>
+          <w:rFonts w:ascii="Times New Roman" w:hAnsi="Times New Roman" w:cs="Times New Roman"/>
+          <w:sz w:val="24"/>
+          <w:szCs w:val="24"/>
+        </w:rPr>
         <w:t>Pipeline Value</w:t>
       </w:r>
       <w:r>
+        <w:rPr>
+          <w:rFonts w:ascii="Times New Roman" w:hAnsi="Times New Roman" w:cs="Times New Roman"/>
+          <w:sz w:val="24"/>
+          <w:szCs w:val="24"/>
+        </w:rPr>
         <w:br/>
         <w:t>Win Rate</w:t>
       </w:r>
       <w:r>
+        <w:rPr>
+          <w:rFonts w:ascii="Times New Roman" w:hAnsi="Times New Roman" w:cs="Times New Roman"/>
+          <w:sz w:val="24"/>
+          <w:szCs w:val="24"/>
+        </w:rPr>
         <w:br/>
         <w:t>Sales Rep Performance</w:t>
       </w:r>
       <w:r>
+        <w:rPr>
+          <w:rFonts w:ascii="Times New Roman" w:hAnsi="Times New Roman" w:cs="Times New Roman"/>
+          <w:sz w:val="24"/>
+          <w:szCs w:val="24"/>
+        </w:rPr>
         <w:br/>
         <w:t>Deal Size by Industry</w:t>
       </w:r>
       <w:r>
+        <w:rPr>
+          <w:rFonts w:ascii="Times New Roman" w:hAnsi="Times New Roman" w:cs="Times New Roman"/>
+          <w:sz w:val="24"/>
+          <w:szCs w:val="24"/>
+        </w:rPr>
         <w:br/>
         <w:t>Sales Funnel</w:t>
       </w:r>
     </w:p>
     <w:p>
       <w:pPr>
-        <w:spacing w:before="100" w:beforeAutospacing="1" w:after="100" w:afterAutospacing="1" w:line="240" w:lineRule="auto"/>
+        <w:spacing w:after="0" w:line="240" w:lineRule="auto"/>
+        <w:rPr>
+          <w:rFonts w:ascii="Times New Roman" w:hAnsi="Times New Roman" w:cs="Times New Roman"/>
+          <w:sz w:val="24"/>
+          <w:szCs w:val="24"/>
+        </w:rPr>
+      </w:pPr>
+    </w:p>
+    <w:p>
+      <w:pPr>
+        <w:spacing w:after="0" w:line="240" w:lineRule="auto"/>
         <w:rPr>
           <w:rFonts w:ascii="Times New Roman" w:eastAsia="Times New Roman" w:hAnsi="Times New Roman" w:cs="Times New Roman"/>
           <w:sz w:val="24"/>
@@ -3808,7 +4003,7 @@
     </w:p>
     <w:p>
       <w:pPr>
-        <w:spacing w:before="100" w:beforeAutospacing="1" w:after="100" w:afterAutospacing="1" w:line="240" w:lineRule="auto"/>
+        <w:spacing w:after="0" w:line="240" w:lineRule="auto"/>
         <w:rPr>
           <w:rFonts w:ascii="Times New Roman" w:eastAsia="Times New Roman" w:hAnsi="Times New Roman" w:cs="Times New Roman"/>
           <w:sz w:val="24"/>
@@ -3826,7 +4021,7 @@
     </w:p>
     <w:p>
       <w:pPr>
-        <w:spacing w:before="100" w:beforeAutospacing="1" w:after="100" w:afterAutospacing="1" w:line="240" w:lineRule="auto"/>
+        <w:spacing w:after="0" w:line="240" w:lineRule="auto"/>
         <w:rPr>
           <w:rFonts w:ascii="Times New Roman" w:eastAsia="Times New Roman" w:hAnsi="Times New Roman" w:cs="Times New Roman"/>
           <w:sz w:val="24"/>
@@ -3844,7 +4039,7 @@
     </w:p>
     <w:p>
       <w:pPr>
-        <w:spacing w:before="100" w:beforeAutospacing="1" w:after="100" w:afterAutospacing="1" w:line="240" w:lineRule="auto"/>
+        <w:spacing w:after="0" w:line="240" w:lineRule="auto"/>
         <w:rPr>
           <w:rFonts w:ascii="Times New Roman" w:eastAsia="Times New Roman" w:hAnsi="Times New Roman" w:cs="Times New Roman"/>
           <w:sz w:val="24"/>
@@ -3862,7 +4057,7 @@
     </w:p>
     <w:p>
       <w:pPr>
-        <w:spacing w:before="100" w:beforeAutospacing="1" w:after="100" w:afterAutospacing="1" w:line="240" w:lineRule="auto"/>
+        <w:spacing w:after="0" w:line="240" w:lineRule="auto"/>
         <w:rPr>
           <w:rFonts w:ascii="Times New Roman" w:eastAsia="Times New Roman" w:hAnsi="Times New Roman" w:cs="Times New Roman"/>
           <w:sz w:val="24"/>
@@ -3880,7 +4075,7 @@
     </w:p>
     <w:p>
       <w:pPr>
-        <w:spacing w:before="100" w:beforeAutospacing="1" w:after="100" w:afterAutospacing="1" w:line="240" w:lineRule="auto"/>
+        <w:spacing w:after="0" w:line="240" w:lineRule="auto"/>
         <w:rPr>
           <w:rFonts w:ascii="Times New Roman" w:eastAsia="Times New Roman" w:hAnsi="Times New Roman" w:cs="Times New Roman"/>
           <w:sz w:val="24"/>
@@ -3898,7 +4093,17 @@
     </w:p>
     <w:p>
       <w:pPr>
-        <w:spacing w:before="100" w:beforeAutospacing="1" w:after="100" w:afterAutospacing="1" w:line="240" w:lineRule="auto"/>
+        <w:spacing w:after="0" w:line="240" w:lineRule="auto"/>
+        <w:rPr>
+          <w:rFonts w:ascii="Times New Roman" w:eastAsia="Times New Roman" w:hAnsi="Times New Roman" w:cs="Times New Roman"/>
+          <w:sz w:val="24"/>
+          <w:szCs w:val="24"/>
+        </w:rPr>
+      </w:pPr>
+    </w:p>
+    <w:p>
+      <w:pPr>
+        <w:spacing w:after="0" w:line="240" w:lineRule="auto"/>
         <w:rPr>
           <w:rFonts w:ascii="Times New Roman" w:eastAsia="Times New Roman" w:hAnsi="Times New Roman" w:cs="Times New Roman"/>
           <w:sz w:val="24"/>
@@ -3916,7 +4121,7 @@
     </w:p>
     <w:p>
       <w:pPr>
-        <w:spacing w:before="100" w:beforeAutospacing="1" w:after="100" w:afterAutospacing="1" w:line="240" w:lineRule="auto"/>
+        <w:spacing w:after="0" w:line="240" w:lineRule="auto"/>
         <w:rPr>
           <w:rFonts w:ascii="Times New Roman" w:eastAsia="Times New Roman" w:hAnsi="Times New Roman" w:cs="Times New Roman"/>
           <w:sz w:val="24"/>
@@ -3934,7 +4139,61 @@
     </w:p>
     <w:p>
       <w:pPr>
-        <w:spacing w:before="100" w:beforeAutospacing="1" w:after="100" w:afterAutospacing="1" w:line="240" w:lineRule="auto"/>
+        <w:spacing w:after="0" w:line="240" w:lineRule="auto"/>
+        <w:rPr>
+          <w:rFonts w:ascii="Times New Roman" w:eastAsia="Times New Roman" w:hAnsi="Times New Roman" w:cs="Times New Roman"/>
+          <w:sz w:val="24"/>
+          <w:szCs w:val="24"/>
+        </w:rPr>
+      </w:pPr>
+      <w:r>
+        <w:rPr>
+          <w:rFonts w:ascii="Times New Roman" w:eastAsia="Times New Roman" w:hAnsi="Times New Roman" w:cs="Times New Roman"/>
+          <w:sz w:val="24"/>
+          <w:szCs w:val="24"/>
+        </w:rPr>
+        <w:t>Conversion Rate</w:t>
+      </w:r>
+    </w:p>
+    <w:p>
+      <w:pPr>
+        <w:spacing w:after="0" w:line="240" w:lineRule="auto"/>
+        <w:rPr>
+          <w:rFonts w:ascii="Times New Roman" w:eastAsia="Times New Roman" w:hAnsi="Times New Roman" w:cs="Times New Roman"/>
+          <w:sz w:val="24"/>
+          <w:szCs w:val="24"/>
+        </w:rPr>
+      </w:pPr>
+      <w:r>
+        <w:rPr>
+          <w:rFonts w:ascii="Times New Roman" w:eastAsia="Times New Roman" w:hAnsi="Times New Roman" w:cs="Times New Roman"/>
+          <w:sz w:val="24"/>
+          <w:szCs w:val="24"/>
+        </w:rPr>
+        <w:t>Channel Performance</w:t>
+      </w:r>
+    </w:p>
+    <w:p>
+      <w:pPr>
+        <w:spacing w:after="0" w:line="240" w:lineRule="auto"/>
+        <w:rPr>
+          <w:rFonts w:ascii="Times New Roman" w:eastAsia="Times New Roman" w:hAnsi="Times New Roman" w:cs="Times New Roman"/>
+          <w:sz w:val="24"/>
+          <w:szCs w:val="24"/>
+        </w:rPr>
+      </w:pPr>
+      <w:r>
+        <w:rPr>
+          <w:rFonts w:ascii="Times New Roman" w:eastAsia="Times New Roman" w:hAnsi="Times New Roman" w:cs="Times New Roman"/>
+          <w:sz w:val="24"/>
+          <w:szCs w:val="24"/>
+        </w:rPr>
+        <w:t>Lead-to-Customer Funnel</w:t>
+      </w:r>
+    </w:p>
+    <w:p>
+      <w:pPr>
+        <w:spacing w:after="0" w:line="240" w:lineRule="auto"/>
         <w:rPr>
           <w:rFonts w:ascii="Times New Roman" w:eastAsia="Times New Roman" w:hAnsi="Times New Roman" w:cs="Times New Roman"/>
           <w:sz w:val="24"/>
@@ -3952,194 +4211,161 @@
     </w:p>
     <w:p>
       <w:pPr>
-        <w:spacing w:before="100" w:beforeAutospacing="1" w:after="100" w:afterAutospacing="1" w:line="240" w:lineRule="auto"/>
-        <w:rPr>
-          <w:rFonts w:ascii="Times New Roman" w:eastAsia="Times New Roman" w:hAnsi="Times New Roman" w:cs="Times New Roman"/>
-          <w:sz w:val="24"/>
-          <w:szCs w:val="24"/>
-        </w:rPr>
-      </w:pPr>
-      <w:r>
-        <w:rPr>
-          <w:rFonts w:ascii="Times New Roman" w:eastAsia="Times New Roman" w:hAnsi="Times New Roman" w:cs="Times New Roman"/>
-          <w:sz w:val="24"/>
-          <w:szCs w:val="24"/>
-        </w:rPr>
-        <w:t>Conversion Rate</w:t>
-      </w:r>
-    </w:p>
-    <w:p>
-      <w:pPr>
-        <w:spacing w:before="100" w:beforeAutospacing="1" w:after="100" w:afterAutospacing="1" w:line="240" w:lineRule="auto"/>
-        <w:rPr>
-          <w:rFonts w:ascii="Times New Roman" w:eastAsia="Times New Roman" w:hAnsi="Times New Roman" w:cs="Times New Roman"/>
-          <w:sz w:val="24"/>
-          <w:szCs w:val="24"/>
-        </w:rPr>
-      </w:pPr>
-      <w:r>
-        <w:rPr>
-          <w:rFonts w:ascii="Times New Roman" w:eastAsia="Times New Roman" w:hAnsi="Times New Roman" w:cs="Times New Roman"/>
-          <w:sz w:val="24"/>
-          <w:szCs w:val="24"/>
-        </w:rPr>
-        <w:t>Channel Performance</w:t>
-      </w:r>
-    </w:p>
-    <w:p>
-      <w:pPr>
-        <w:spacing w:before="100" w:beforeAutospacing="1" w:after="100" w:afterAutospacing="1" w:line="240" w:lineRule="auto"/>
-        <w:rPr>
-          <w:rFonts w:ascii="Times New Roman" w:eastAsia="Times New Roman" w:hAnsi="Times New Roman" w:cs="Times New Roman"/>
-          <w:sz w:val="24"/>
-          <w:szCs w:val="24"/>
-        </w:rPr>
-      </w:pPr>
-      <w:r>
-        <w:rPr>
-          <w:rFonts w:ascii="Times New Roman" w:eastAsia="Times New Roman" w:hAnsi="Times New Roman" w:cs="Times New Roman"/>
-          <w:sz w:val="24"/>
-          <w:szCs w:val="24"/>
-        </w:rPr>
-        <w:t>Lead-to-Customer Funnel</w:t>
-      </w:r>
-    </w:p>
-    <w:p>
-      <w:pPr>
-        <w:spacing w:before="100" w:beforeAutospacing="1" w:after="100" w:afterAutospacing="1" w:line="240" w:lineRule="auto"/>
-        <w:rPr>
-          <w:rFonts w:ascii="Times New Roman" w:eastAsia="Times New Roman" w:hAnsi="Times New Roman" w:cs="Times New Roman"/>
-          <w:sz w:val="24"/>
-          <w:szCs w:val="24"/>
-        </w:rPr>
-      </w:pPr>
-      <w:r>
-        <w:rPr>
-          <w:rFonts w:ascii="Times New Roman" w:eastAsia="Times New Roman" w:hAnsi="Times New Roman" w:cs="Times New Roman"/>
-          <w:sz w:val="24"/>
-          <w:szCs w:val="24"/>
-        </w:rPr>
-        <w:t>Page 5: AI Decision Center</w:t>
-      </w:r>
-    </w:p>
-    <w:p>
-      <w:pPr>
-        <w:spacing w:before="100" w:beforeAutospacing="1" w:after="100" w:afterAutospacing="1" w:line="240" w:lineRule="auto"/>
-        <w:rPr>
-          <w:rFonts w:ascii="Times New Roman" w:eastAsia="Times New Roman" w:hAnsi="Times New Roman" w:cs="Times New Roman"/>
-          <w:sz w:val="24"/>
-          <w:szCs w:val="24"/>
-        </w:rPr>
-      </w:pPr>
-      <w:r>
-        <w:rPr>
-          <w:rFonts w:ascii="Times New Roman" w:eastAsia="Times New Roman" w:hAnsi="Times New Roman" w:cs="Times New Roman"/>
-          <w:sz w:val="24"/>
-          <w:szCs w:val="24"/>
-        </w:rPr>
-        <w:t>This is the page that makes the project stand out.</w:t>
-      </w:r>
-    </w:p>
-    <w:p>
-      <w:pPr>
-        <w:spacing w:before="100" w:beforeAutospacing="1" w:after="100" w:afterAutospacing="1" w:line="240" w:lineRule="auto"/>
-        <w:rPr>
-          <w:rFonts w:ascii="Times New Roman" w:eastAsia="Times New Roman" w:hAnsi="Times New Roman" w:cs="Times New Roman"/>
-          <w:sz w:val="24"/>
-          <w:szCs w:val="24"/>
-        </w:rPr>
-      </w:pPr>
-      <w:r>
-        <w:rPr>
-          <w:rFonts w:ascii="Times New Roman" w:eastAsia="Times New Roman" w:hAnsi="Times New Roman" w:cs="Times New Roman"/>
-          <w:sz w:val="24"/>
-          <w:szCs w:val="24"/>
-        </w:rPr>
-        <w:t>Examples:</w:t>
-      </w:r>
+        <w:spacing w:after="0" w:line="240" w:lineRule="auto"/>
+        <w:rPr>
+          <w:rFonts w:ascii="Times New Roman" w:eastAsia="Times New Roman" w:hAnsi="Times New Roman" w:cs="Times New Roman"/>
+          <w:sz w:val="24"/>
+          <w:szCs w:val="24"/>
+        </w:rPr>
+      </w:pPr>
       <w:bookmarkStart w:id="0" w:name="_GoBack"/>
       <w:bookmarkEnd w:id="0"/>
     </w:p>
     <w:p>
       <w:pPr>
-        <w:spacing w:before="100" w:beforeAutospacing="1" w:after="100" w:afterAutospacing="1" w:line="240" w:lineRule="auto"/>
-        <w:rPr>
-          <w:rFonts w:ascii="Times New Roman" w:eastAsia="Times New Roman" w:hAnsi="Times New Roman" w:cs="Times New Roman"/>
-          <w:sz w:val="24"/>
-          <w:szCs w:val="24"/>
-        </w:rPr>
-      </w:pPr>
-      <w:r>
-        <w:rPr>
-          <w:rFonts w:ascii="Times New Roman" w:eastAsia="Times New Roman" w:hAnsi="Times New Roman" w:cs="Times New Roman"/>
-          <w:sz w:val="24"/>
-          <w:szCs w:val="24"/>
-        </w:rPr>
-        <w:t>🟢 Increase investment in Google Ads</w:t>
-      </w:r>
-    </w:p>
-    <w:p>
-      <w:pPr>
-        <w:spacing w:before="100" w:beforeAutospacing="1" w:after="100" w:afterAutospacing="1" w:line="240" w:lineRule="auto"/>
-        <w:rPr>
-          <w:rFonts w:ascii="Times New Roman" w:eastAsia="Times New Roman" w:hAnsi="Times New Roman" w:cs="Times New Roman"/>
-          <w:sz w:val="24"/>
-          <w:szCs w:val="24"/>
-        </w:rPr>
-      </w:pPr>
-      <w:r>
-        <w:rPr>
-          <w:rFonts w:ascii="Times New Roman" w:eastAsia="Times New Roman" w:hAnsi="Times New Roman" w:cs="Times New Roman"/>
-          <w:sz w:val="24"/>
-          <w:szCs w:val="24"/>
-        </w:rPr>
-        <w:t>🟢 Focus retention efforts on Healthcare customers</w:t>
-      </w:r>
-    </w:p>
-    <w:p>
-      <w:pPr>
-        <w:spacing w:before="100" w:beforeAutospacing="1" w:after="100" w:afterAutospacing="1" w:line="240" w:lineRule="auto"/>
-        <w:rPr>
-          <w:rFonts w:ascii="Times New Roman" w:eastAsia="Times New Roman" w:hAnsi="Times New Roman" w:cs="Times New Roman"/>
-          <w:sz w:val="24"/>
-          <w:szCs w:val="24"/>
-        </w:rPr>
-      </w:pPr>
-      <w:r>
-        <w:rPr>
-          <w:rFonts w:ascii="Times New Roman" w:eastAsia="Times New Roman" w:hAnsi="Times New Roman" w:cs="Times New Roman"/>
-          <w:sz w:val="24"/>
-          <w:szCs w:val="24"/>
-        </w:rPr>
-        <w:t>🟢 Revenue forecast exceeds target by 8%</w:t>
-      </w:r>
-    </w:p>
-    <w:p>
-      <w:pPr>
-        <w:spacing w:before="100" w:beforeAutospacing="1" w:after="100" w:afterAutospacing="1" w:line="240" w:lineRule="auto"/>
-        <w:rPr>
-          <w:rFonts w:ascii="Times New Roman" w:eastAsia="Times New Roman" w:hAnsi="Times New Roman" w:cs="Times New Roman"/>
-          <w:sz w:val="24"/>
-          <w:szCs w:val="24"/>
-        </w:rPr>
-      </w:pPr>
-      <w:r>
-        <w:rPr>
-          <w:rFonts w:ascii="Segoe UI Symbol" w:eastAsia="Times New Roman" w:hAnsi="Segoe UI Symbol" w:cs="Segoe UI Symbol"/>
-          <w:sz w:val="24"/>
-          <w:szCs w:val="24"/>
-        </w:rPr>
-        <w:lastRenderedPageBreak/>
-        <w:t>🔴</w:t>
-      </w:r>
-      <w:r>
-        <w:rPr>
-          <w:rFonts w:ascii="Times New Roman" w:eastAsia="Times New Roman" w:hAnsi="Times New Roman" w:cs="Times New Roman"/>
-          <w:sz w:val="24"/>
-          <w:szCs w:val="24"/>
-        </w:rPr>
-        <w:t xml:space="preserve"> SMB segment showing declining expansion revenue</w:t>
-      </w:r>
+        <w:spacing w:after="0" w:line="240" w:lineRule="auto"/>
+        <w:rPr>
+          <w:rFonts w:ascii="Times New Roman" w:eastAsia="Times New Roman" w:hAnsi="Times New Roman" w:cs="Times New Roman"/>
+          <w:sz w:val="24"/>
+          <w:szCs w:val="24"/>
+        </w:rPr>
+      </w:pPr>
+    </w:p>
+    <w:p>
+      <w:pPr>
+        <w:spacing w:before="100" w:beforeAutospacing="1" w:after="0" w:line="240" w:lineRule="auto"/>
+        <w:rPr>
+          <w:rFonts w:ascii="Times New Roman" w:eastAsia="Times New Roman" w:hAnsi="Times New Roman" w:cs="Times New Roman"/>
+          <w:sz w:val="24"/>
+          <w:szCs w:val="24"/>
+        </w:rPr>
+      </w:pPr>
+      <w:r>
+        <w:rPr>
+          <w:rFonts w:ascii="Times New Roman" w:eastAsia="Times New Roman" w:hAnsi="Times New Roman" w:cs="Times New Roman"/>
+          <w:sz w:val="24"/>
+          <w:szCs w:val="24"/>
+        </w:rPr>
+        <w:t>Page 5: AI Decision Center</w:t>
+      </w:r>
+    </w:p>
+    <w:p>
+      <w:pPr>
+        <w:spacing w:after="0" w:line="240" w:lineRule="auto"/>
+        <w:rPr>
+          <w:rFonts w:ascii="Times New Roman" w:eastAsia="Times New Roman" w:hAnsi="Times New Roman" w:cs="Times New Roman"/>
+          <w:sz w:val="24"/>
+          <w:szCs w:val="24"/>
+        </w:rPr>
+      </w:pPr>
+      <w:r>
+        <w:rPr>
+          <w:rFonts w:ascii="Times New Roman" w:eastAsia="Times New Roman" w:hAnsi="Times New Roman" w:cs="Times New Roman"/>
+          <w:sz w:val="24"/>
+          <w:szCs w:val="24"/>
+        </w:rPr>
+        <w:t>This is the page that makes the project stand out.</w:t>
+      </w:r>
+    </w:p>
+    <w:p>
+      <w:pPr>
+        <w:spacing w:after="0" w:line="240" w:lineRule="auto"/>
+        <w:rPr>
+          <w:rFonts w:ascii="Times New Roman" w:eastAsia="Times New Roman" w:hAnsi="Times New Roman" w:cs="Times New Roman"/>
+          <w:sz w:val="24"/>
+          <w:szCs w:val="24"/>
+        </w:rPr>
+      </w:pPr>
+      <w:r>
+        <w:rPr>
+          <w:rFonts w:ascii="Times New Roman" w:eastAsia="Times New Roman" w:hAnsi="Times New Roman" w:cs="Times New Roman"/>
+          <w:sz w:val="24"/>
+          <w:szCs w:val="24"/>
+        </w:rPr>
+        <w:t>Examples:</w:t>
+      </w:r>
+    </w:p>
+    <w:p>
+      <w:pPr>
+        <w:spacing w:after="0" w:line="240" w:lineRule="auto"/>
+        <w:rPr>
+          <w:rFonts w:ascii="Times New Roman" w:eastAsia="Times New Roman" w:hAnsi="Times New Roman" w:cs="Times New Roman"/>
+          <w:sz w:val="24"/>
+          <w:szCs w:val="24"/>
+        </w:rPr>
+      </w:pPr>
+      <w:r>
+        <w:rPr>
+          <w:rFonts w:ascii="Times New Roman" w:eastAsia="Times New Roman" w:hAnsi="Times New Roman" w:cs="Times New Roman"/>
+          <w:sz w:val="24"/>
+          <w:szCs w:val="24"/>
+        </w:rPr>
+        <w:t>Increase investment in Google Ads</w:t>
+      </w:r>
+    </w:p>
+    <w:p>
+      <w:pPr>
+        <w:spacing w:after="0" w:line="240" w:lineRule="auto"/>
+        <w:rPr>
+          <w:rFonts w:ascii="Times New Roman" w:eastAsia="Times New Roman" w:hAnsi="Times New Roman" w:cs="Times New Roman"/>
+          <w:sz w:val="24"/>
+          <w:szCs w:val="24"/>
+        </w:rPr>
+      </w:pPr>
+      <w:r>
+        <w:rPr>
+          <w:rFonts w:ascii="Times New Roman" w:eastAsia="Times New Roman" w:hAnsi="Times New Roman" w:cs="Times New Roman"/>
+          <w:sz w:val="24"/>
+          <w:szCs w:val="24"/>
+        </w:rPr>
+        <w:t>Focus retention efforts on Healthcare customers</w:t>
+      </w:r>
+    </w:p>
+    <w:p>
+      <w:pPr>
+        <w:spacing w:after="0" w:line="240" w:lineRule="auto"/>
+        <w:rPr>
+          <w:rFonts w:ascii="Times New Roman" w:eastAsia="Times New Roman" w:hAnsi="Times New Roman" w:cs="Times New Roman"/>
+          <w:sz w:val="24"/>
+          <w:szCs w:val="24"/>
+        </w:rPr>
+      </w:pPr>
+      <w:r>
+        <w:rPr>
+          <w:rFonts w:ascii="Times New Roman" w:eastAsia="Times New Roman" w:hAnsi="Times New Roman" w:cs="Times New Roman"/>
+          <w:sz w:val="24"/>
+          <w:szCs w:val="24"/>
+        </w:rPr>
+        <w:t>Revenue forecast exceeds target by 8%</w:t>
+      </w:r>
+    </w:p>
+    <w:p>
+      <w:pPr>
+        <w:spacing w:after="0" w:line="240" w:lineRule="auto"/>
+        <w:rPr>
+          <w:rFonts w:ascii="Times New Roman" w:eastAsia="Times New Roman" w:hAnsi="Times New Roman" w:cs="Times New Roman"/>
+          <w:sz w:val="24"/>
+          <w:szCs w:val="24"/>
+        </w:rPr>
+      </w:pPr>
+      <w:r>
+        <w:rPr>
+          <w:rFonts w:ascii="Times New Roman" w:eastAsia="Times New Roman" w:hAnsi="Times New Roman" w:cs="Times New Roman"/>
+          <w:sz w:val="24"/>
+          <w:szCs w:val="24"/>
+        </w:rPr>
+        <w:t>SMB segment showing declining expansion revenue</w:t>
+      </w:r>
+    </w:p>
+    <w:p>
+      <w:pPr>
+        <w:spacing w:after="0" w:line="240" w:lineRule="auto"/>
+        <w:rPr>
+          <w:rFonts w:ascii="Times New Roman" w:eastAsia="Times New Roman" w:hAnsi="Times New Roman" w:cs="Times New Roman"/>
+          <w:sz w:val="24"/>
+          <w:szCs w:val="24"/>
+        </w:rPr>
+      </w:pPr>
     </w:p>
     <w:p>
       <w:pPr>
@@ -4156,8 +4382,8 @@
           <w:b/>
           <w:bCs/>
           <w:kern w:val="36"/>
-          <w:sz w:val="48"/>
-          <w:szCs w:val="48"/>
+          <w:sz w:val="24"/>
+          <w:szCs w:val="24"/>
         </w:rPr>
         <w:t xml:space="preserve">Phase 7 </w:t>
       </w:r>
@@ -4194,8 +4420,6 @@
         <w:t>Create architecture diagram, screenshots, README, and resume bullets to showcase the project.</w:t>
       </w:r>
     </w:p>
-    <w:p/>
-    <w:p/>
     <w:sectPr>
       <w:pgSz w:w="12240" w:h="15840"/>
       <w:pgMar w:top="1440" w:right="1440" w:bottom="1440" w:left="1440" w:header="720" w:footer="720" w:gutter="0"/>

</xml_diff>